<commit_message>
Scroll / Light toggle button.
</commit_message>
<xml_diff>
--- a/blog-module/blog-entries/20260402G/Τεχνική Ανάλυση FW48 2026.docx
+++ b/blog-module/blog-entries/20260402G/Τεχνική Ανάλυση FW48 2026.docx
@@ -42,7 +42,7 @@
         <w:pStyle w:val="a4"/>
         <w:jc w:val="left"/>
         <w:rPr>
-          <w:lang w:val="de-DE"/>
+          <w:lang w:val="el-GR"/>
         </w:rPr>
       </w:pPr>
       <w:r>
@@ -107,7 +107,7 @@
         <w:rPr>
           <w:lang w:val="el-GR"/>
         </w:rPr>
-        <w:t xml:space="preserve">47 αλλά προσπάθησε να προσαρμοστεί στα ραγδαία εξελισσόμενα δεδομένα. Ακολουθεί μια τεχνική ανασκόπηση σε οκτώ ενότητες, εμπνευσμένη από τα αναλυτικά άρθρα του </w:t>
+        <w:t xml:space="preserve">47 αλλά προσπάθησε να προσαρμοστεί στα ραγδαία εξελισσόμενα δεδομένα. Ακολουθεί μια τεχνική ανασκόπηση, εμπνευσμένη από τα αναλυτικά άρθρα του </w:t>
       </w:r>
       <w:r>
         <w:rPr>
@@ -144,16 +144,31 @@
         <w:rPr>
           <w:lang w:val="el-GR"/>
         </w:rPr>
-        <w:t xml:space="preserve">47 (2024–25), με βάση τα δημόσια στοιχεία και τα ρεπορτάζ για το </w:t>
-      </w:r>
-      <w:r>
-        <w:t>FW</w:t>
-      </w:r>
-      <w:r>
-        <w:rPr>
-          <w:lang w:val="el-GR"/>
-        </w:rPr>
-        <w:t>48.</w:t>
+        <w:t>47 (2024–</w:t>
+      </w:r>
+      <w:r>
+        <w:rPr>
+          <w:lang w:val="el-GR"/>
+        </w:rPr>
+        <w:t>20</w:t>
+      </w:r>
+      <w:r>
+        <w:rPr>
+          <w:lang w:val="el-GR"/>
+        </w:rPr>
+        <w:t>25</w:t>
+      </w:r>
+      <w:r>
+        <w:rPr>
+          <w:lang w:val="el-GR"/>
+        </w:rPr>
+        <w:t>)</w:t>
+      </w:r>
+      <w:r>
+        <w:rPr>
+          <w:lang w:val="el-GR"/>
+        </w:rPr>
+        <w:t>.</w:t>
       </w:r>
     </w:p>
     <w:p>
@@ -175,6 +190,24 @@
         <w:instrText xml:space="preserve"> INCLUDEPICTURE "https://formula1-data.com/assets/img/uploads/2026/02/williams-unveils-fw48-2026-f1-livery-9.jpg" \* MERGEFORMATINET </w:instrText>
       </w:r>
       <w:r>
+        <w:fldChar w:fldCharType="separate"/>
+      </w:r>
+      <w:r>
+        <w:rPr>
+          <w:noProof/>
+        </w:rPr>
+        <w:fldChar w:fldCharType="begin"/>
+      </w:r>
+      <w:r>
+        <w:rPr>
+          <w:noProof/>
+        </w:rPr>
+        <w:instrText xml:space="preserve"> INCLUDEPICTURE  "https://formula1-data.com/assets/img/uploads/2026/02/williams-unveils-fw48-2026-f1-livery-9.jpg" \* MERGEFORMATINET </w:instrText>
+      </w:r>
+      <w:r>
+        <w:rPr>
+          <w:noProof/>
+        </w:rPr>
         <w:fldChar w:fldCharType="separate"/>
       </w:r>
       <w:r>
@@ -231,6 +264,12 @@
         <w:fldChar w:fldCharType="end"/>
       </w:r>
       <w:r>
+        <w:rPr>
+          <w:noProof/>
+        </w:rPr>
+        <w:fldChar w:fldCharType="end"/>
+      </w:r>
+      <w:r>
         <w:fldChar w:fldCharType="end"/>
       </w:r>
     </w:p>
@@ -313,14 +352,14 @@
         <w:rPr>
           <w:lang w:val="el-GR"/>
         </w:rPr>
-        <w:t xml:space="preserve"> </w:t>
+        <w:t xml:space="preserve"> ώστε να διατηρείται υψηλή ακαμψία, ενώ το βάρος επιτρέπεται να τοποθετείται </w:t>
       </w:r>
       <w:r>
         <w:rPr>
           <w:lang w:val="el-GR"/>
         </w:rPr>
         <w:lastRenderedPageBreak/>
-        <w:t xml:space="preserve">ώστε να διατηρείται υψηλή ακαμψία, ενώ το βάρος επιτρέπεται να τοποθετείται στρατηγικά μέσω πρόσθετων </w:t>
+        <w:t xml:space="preserve">στρατηγικά μέσω πρόσθετων </w:t>
       </w:r>
       <w:r>
         <w:rPr>
@@ -430,7 +469,19 @@
         <w:rPr>
           <w:lang w:val="el-GR"/>
         </w:rPr>
-        <w:t xml:space="preserve"> μικρότερο) και στενότερο δάπεδο, γεγονός που συμπιέζει τον χώρο για εξαρτήματα και απαιτεί έξυπνη συσκευασία.</w:t>
+        <w:t xml:space="preserve"> μικρότερο) και στενότερο δάπεδο, γεγονός που συμπιέζει τον χώρο για εξαρτήματα και απαιτεί έξυπνη </w:t>
+      </w:r>
+      <w:r>
+        <w:rPr>
+          <w:lang w:val="el-GR"/>
+        </w:rPr>
+        <w:t>σχεδίαση</w:t>
+      </w:r>
+      <w:r>
+        <w:rPr>
+          <w:lang w:val="el-GR"/>
+        </w:rPr>
+        <w:t>.</w:t>
       </w:r>
     </w:p>
     <w:p>
@@ -455,6 +506,24 @@
         <w:instrText xml:space="preserve"> INCLUDEPICTURE "https://formula1-data.com/assets/img/uploads/2026/02/williams-unveils-fw48-2026-f1-livery-11.jpg" \* MERGEFORMATINET </w:instrText>
       </w:r>
       <w:r>
+        <w:fldChar w:fldCharType="separate"/>
+      </w:r>
+      <w:r>
+        <w:rPr>
+          <w:noProof/>
+        </w:rPr>
+        <w:fldChar w:fldCharType="begin"/>
+      </w:r>
+      <w:r>
+        <w:rPr>
+          <w:noProof/>
+        </w:rPr>
+        <w:instrText xml:space="preserve"> INCLUDEPICTURE  "https://formula1-data.com/assets/img/uploads/2026/02/williams-unveils-fw48-2026-f1-livery-11.jpg" \* MERGEFORMATINET </w:instrText>
+      </w:r>
+      <w:r>
+        <w:rPr>
+          <w:noProof/>
+        </w:rPr>
         <w:fldChar w:fldCharType="separate"/>
       </w:r>
       <w:r>
@@ -492,6 +561,12 @@
         <w:fldChar w:fldCharType="end"/>
       </w:r>
       <w:r>
+        <w:rPr>
+          <w:noProof/>
+        </w:rPr>
+        <w:fldChar w:fldCharType="end"/>
+      </w:r>
+      <w:r>
         <w:fldChar w:fldCharType="end"/>
       </w:r>
     </w:p>
@@ -518,6 +593,24 @@
         <w:instrText xml:space="preserve"> INCLUDEPICTURE "https://formula1-data.com/assets/img/uploads/2026/02/williams-unveils-fw48-2026-f1-livery-10.jpg" \* MERGEFORMATINET </w:instrText>
       </w:r>
       <w:r>
+        <w:fldChar w:fldCharType="separate"/>
+      </w:r>
+      <w:r>
+        <w:rPr>
+          <w:noProof/>
+        </w:rPr>
+        <w:fldChar w:fldCharType="begin"/>
+      </w:r>
+      <w:r>
+        <w:rPr>
+          <w:noProof/>
+        </w:rPr>
+        <w:instrText xml:space="preserve"> INCLUDEPICTURE  "https://formula1-data.com/assets/img/uploads/2026/02/williams-unveils-fw48-2026-f1-livery-10.jpg" \* MERGEFORMATINET </w:instrText>
+      </w:r>
+      <w:r>
+        <w:rPr>
+          <w:noProof/>
+        </w:rPr>
         <w:fldChar w:fldCharType="separate"/>
       </w:r>
       <w:r>
@@ -555,6 +648,12 @@
         <w:fldChar w:fldCharType="end"/>
       </w:r>
       <w:r>
+        <w:rPr>
+          <w:noProof/>
+        </w:rPr>
+        <w:fldChar w:fldCharType="end"/>
+      </w:r>
+      <w:r>
         <w:fldChar w:fldCharType="end"/>
       </w:r>
     </w:p>
@@ -579,7 +678,19 @@
         <w:rPr>
           <w:lang w:val="el-GR"/>
         </w:rPr>
-        <w:t>2. Σχεδίαση Ρινός και Αεροδυναμική Οροφής</w:t>
+        <w:t xml:space="preserve">2. Σχεδίαση </w:t>
+      </w:r>
+      <w:r>
+        <w:rPr>
+          <w:lang w:val="el-GR"/>
+        </w:rPr>
+        <w:t>Μύτης</w:t>
+      </w:r>
+      <w:r>
+        <w:rPr>
+          <w:lang w:val="el-GR"/>
+        </w:rPr>
+        <w:t xml:space="preserve"> και Αεροδυναμική Οροφής</w:t>
       </w:r>
     </w:p>
     <w:p>
@@ -803,6 +914,24 @@
         <w:instrText xml:space="preserve"> INCLUDEPICTURE "https://formula1-data.com/assets/img/uploads/2026/02/williams-unveils-fw48-2026-f1-livery-12.jpg" \* MERGEFORMATINET </w:instrText>
       </w:r>
       <w:r>
+        <w:fldChar w:fldCharType="separate"/>
+      </w:r>
+      <w:r>
+        <w:rPr>
+          <w:noProof/>
+        </w:rPr>
+        <w:fldChar w:fldCharType="begin"/>
+      </w:r>
+      <w:r>
+        <w:rPr>
+          <w:noProof/>
+        </w:rPr>
+        <w:instrText xml:space="preserve"> INCLUDEPICTURE  "https://formula1-data.com/assets/img/uploads/2026/02/williams-unveils-fw48-2026-f1-livery-12.jpg" \* MERGEFORMATINET </w:instrText>
+      </w:r>
+      <w:r>
+        <w:rPr>
+          <w:noProof/>
+        </w:rPr>
         <w:fldChar w:fldCharType="separate"/>
       </w:r>
       <w:r>
@@ -840,8 +969,14 @@
         <w:fldChar w:fldCharType="end"/>
       </w:r>
       <w:r>
+        <w:rPr>
+          <w:noProof/>
+        </w:rPr>
         <w:fldChar w:fldCharType="end"/>
       </w:r>
+      <w:r>
+        <w:fldChar w:fldCharType="end"/>
+      </w:r>
     </w:p>
     <w:p>
       <w:pPr>
@@ -854,7 +989,19 @@
         <w:rPr>
           <w:lang w:val="el-GR"/>
         </w:rPr>
-        <w:t xml:space="preserve">Εικόνα1: Σχέδιο πρόσοψης του </w:t>
+        <w:t>Εικόνα</w:t>
+      </w:r>
+      <w:r>
+        <w:rPr>
+          <w:lang w:val="el-GR"/>
+        </w:rPr>
+        <w:t xml:space="preserve"> </w:t>
+      </w:r>
+      <w:r>
+        <w:rPr>
+          <w:lang w:val="el-GR"/>
+        </w:rPr>
+        <w:t xml:space="preserve">1: Σχέδιο πρόσοψης του </w:t>
       </w:r>
       <w:r>
         <w:t>FW</w:t>
@@ -965,16 +1112,10 @@
         <w:t xml:space="preserve"> τούνελ, ώστε να μειωθεί η ευαισθησία σε «</w:t>
       </w:r>
       <w:r>
-        <w:t>dirty</w:t>
-      </w:r>
-      <w:r>
-        <w:rPr>
-          <w:lang w:val="el-GR"/>
-        </w:rPr>
-        <w:t xml:space="preserve"> </w:t>
-      </w:r>
-      <w:r>
-        <w:t>air</w:t>
+        <w:rPr>
+          <w:lang w:val="el-GR"/>
+        </w:rPr>
+        <w:t>βρώμικο αέρα</w:t>
       </w:r>
       <w:r>
         <w:rPr>
@@ -1003,7 +1144,19 @@
         <w:rPr>
           <w:lang w:val="el-GR"/>
         </w:rPr>
-        <w:t xml:space="preserve"> και σχετικά μικρές εισαγωγές για να τροφοδοτούν το ψυκτικό σύστημα της </w:t>
+        <w:t xml:space="preserve"> και σχετικά μικρές εισαγωγές για να τροφοδοτούν το ψυκτικό σύστημα </w:t>
+      </w:r>
+      <w:r>
+        <w:rPr>
+          <w:lang w:val="el-GR"/>
+        </w:rPr>
+        <w:t xml:space="preserve">του κινητήρα </w:t>
+      </w:r>
+      <w:r>
+        <w:rPr>
+          <w:lang w:val="el-GR"/>
+        </w:rPr>
+        <w:t xml:space="preserve">της </w:t>
       </w:r>
       <w:r>
         <w:t>Mercedes</w:t>
@@ -1080,7 +1233,19 @@
         <w:rPr>
           <w:lang w:val="el-GR"/>
         </w:rPr>
-        <w:t>47.</w:t>
+        <w:t>47</w:t>
+      </w:r>
+      <w:r>
+        <w:rPr>
+          <w:lang w:val="el-GR"/>
+        </w:rPr>
+        <w:t xml:space="preserve"> κοντα στο τέλος της σεζόν</w:t>
+      </w:r>
+      <w:r>
+        <w:rPr>
+          <w:lang w:val="el-GR"/>
+        </w:rPr>
+        <w:t>.</w:t>
       </w:r>
     </w:p>
     <w:p>
@@ -1143,7 +1308,10 @@
         <w:t xml:space="preserve"> για τη διαχείριση των </w:t>
       </w:r>
       <w:r>
-        <w:t>vortices</w:t>
+        <w:rPr>
+          <w:lang w:val="el-GR"/>
+        </w:rPr>
+        <w:t>στροβιλισμών</w:t>
       </w:r>
       <w:r>
         <w:rPr>
@@ -1176,6 +1344,24 @@
         <w:instrText xml:space="preserve"> INCLUDEPICTURE "https://formula1-data.com/assets/img/uploads/2026/02/williams-unveils-fw48-2026-f1-livery-8.jpg" \* MERGEFORMATINET </w:instrText>
       </w:r>
       <w:r>
+        <w:fldChar w:fldCharType="separate"/>
+      </w:r>
+      <w:r>
+        <w:rPr>
+          <w:noProof/>
+        </w:rPr>
+        <w:fldChar w:fldCharType="begin"/>
+      </w:r>
+      <w:r>
+        <w:rPr>
+          <w:noProof/>
+        </w:rPr>
+        <w:instrText xml:space="preserve"> INCLUDEPICTURE  "https://formula1-data.com/assets/img/uploads/2026/02/williams-unveils-fw48-2026-f1-livery-8.jpg" \* MERGEFORMATINET </w:instrText>
+      </w:r>
+      <w:r>
+        <w:rPr>
+          <w:noProof/>
+        </w:rPr>
         <w:fldChar w:fldCharType="separate"/>
       </w:r>
       <w:r>
@@ -1213,8 +1399,14 @@
         <w:fldChar w:fldCharType="end"/>
       </w:r>
       <w:r>
+        <w:rPr>
+          <w:noProof/>
+        </w:rPr>
         <w:fldChar w:fldCharType="end"/>
       </w:r>
+      <w:r>
+        <w:fldChar w:fldCharType="end"/>
+      </w:r>
     </w:p>
     <w:p>
       <w:pPr>
@@ -1238,6 +1430,24 @@
         <w:instrText xml:space="preserve"> INCLUDEPICTURE "https://formula1-data.com/assets/img/uploads/2026/02/williams-unveils-fw48-2026-f1-livery-7.jpg" \* MERGEFORMATINET </w:instrText>
       </w:r>
       <w:r>
+        <w:fldChar w:fldCharType="separate"/>
+      </w:r>
+      <w:r>
+        <w:rPr>
+          <w:noProof/>
+        </w:rPr>
+        <w:fldChar w:fldCharType="begin"/>
+      </w:r>
+      <w:r>
+        <w:rPr>
+          <w:noProof/>
+        </w:rPr>
+        <w:instrText xml:space="preserve"> INCLUDEPICTURE  "https://formula1-data.com/assets/img/uploads/2026/02/williams-unveils-fw48-2026-f1-livery-7.jpg" \* MERGEFORMATINET </w:instrText>
+      </w:r>
+      <w:r>
+        <w:rPr>
+          <w:noProof/>
+        </w:rPr>
         <w:fldChar w:fldCharType="separate"/>
       </w:r>
       <w:r>
@@ -1275,6 +1485,12 @@
         <w:fldChar w:fldCharType="end"/>
       </w:r>
       <w:r>
+        <w:rPr>
+          <w:noProof/>
+        </w:rPr>
+        <w:fldChar w:fldCharType="end"/>
+      </w:r>
+      <w:r>
         <w:fldChar w:fldCharType="end"/>
       </w:r>
     </w:p>
@@ -1556,7 +1772,19 @@
         <w:rPr>
           <w:lang w:val="el-GR"/>
         </w:rPr>
-        <w:t xml:space="preserve">48 εκμεταλλεύεται το μειωμένο μεταξόνιο για καλύτερη ευελιξία στις αργές στροφές, αλλά διατηρεί το ρυθμιζόμενο μεταξόνιο μέσω μπαλαστ. Ο </w:t>
+        <w:t>48 εκμεταλλεύεται το μειωμένο μεταξόνιο για καλύτερη ευελιξία στις αργές στροφές, αλλά διατηρεί το ρυθμιζόμενο μεταξόνιο μέσω μπαλαστ</w:t>
+      </w:r>
+      <w:r>
+        <w:rPr>
+          <w:lang w:val="el-GR"/>
+        </w:rPr>
+        <w:t xml:space="preserve"> (βάρους)</w:t>
+      </w:r>
+      <w:r>
+        <w:rPr>
+          <w:lang w:val="el-GR"/>
+        </w:rPr>
+        <w:t xml:space="preserve">. Ο </w:t>
       </w:r>
       <w:r>
         <w:rPr>
@@ -1603,6 +1831,24 @@
         <w:instrText xml:space="preserve"> INCLUDEPICTURE "https://formula1-data.com/assets/img/uploads/2026/02/williams-unveils-fw48-2026-f1-livery-6.jpg" \* MERGEFORMATINET </w:instrText>
       </w:r>
       <w:r>
+        <w:fldChar w:fldCharType="separate"/>
+      </w:r>
+      <w:r>
+        <w:rPr>
+          <w:noProof/>
+        </w:rPr>
+        <w:fldChar w:fldCharType="begin"/>
+      </w:r>
+      <w:r>
+        <w:rPr>
+          <w:noProof/>
+        </w:rPr>
+        <w:instrText xml:space="preserve"> INCLUDEPICTURE  "https://formula1-data.com/assets/img/uploads/2026/02/williams-unveils-fw48-2026-f1-livery-6.jpg" \* MERGEFORMATINET </w:instrText>
+      </w:r>
+      <w:r>
+        <w:rPr>
+          <w:noProof/>
+        </w:rPr>
         <w:fldChar w:fldCharType="separate"/>
       </w:r>
       <w:r>
@@ -1640,6 +1886,12 @@
         <w:fldChar w:fldCharType="end"/>
       </w:r>
       <w:r>
+        <w:rPr>
+          <w:noProof/>
+        </w:rPr>
+        <w:fldChar w:fldCharType="end"/>
+      </w:r>
+      <w:r>
         <w:fldChar w:fldCharType="end"/>
       </w:r>
     </w:p>
@@ -1973,7 +2225,43 @@
         <w:rPr>
           <w:lang w:val="el-GR"/>
         </w:rPr>
-        <w:t xml:space="preserve"> αντιμετώπισε περιορισμένο χρόνο δοκιμών. Το αυτοκίνητο παρουσιάστηκε καθυστερημένα και έχασε την ιδιωτική δοκιμή στη Βαρκελώνη, κάνοντας την πρώτη του εμφάνιση σε κινηματογράφηση στο </w:t>
+        <w:t xml:space="preserve"> αντιμετώπισε περιορισμένο χρόνο δοκιμών. Το αυτοκίνητο παρουσιάστηκε καθυστερημένα και έχασε την </w:t>
+      </w:r>
+      <w:r>
+        <w:rPr>
+          <w:lang w:val="el-GR"/>
+        </w:rPr>
+        <w:t>κλειστή</w:t>
+      </w:r>
+      <w:r>
+        <w:rPr>
+          <w:lang w:val="el-GR"/>
+        </w:rPr>
+        <w:t xml:space="preserve"> δοκιμή στη Βαρκελώνη, κάνοντας την πρώτη του εμφάνιση σε </w:t>
+      </w:r>
+      <w:r>
+        <w:rPr>
+          <w:lang w:val="el-GR"/>
+        </w:rPr>
+        <w:t>„</w:t>
+      </w:r>
+      <w:r>
+        <w:rPr>
+          <w:lang w:val="el-GR"/>
+        </w:rPr>
+        <w:t>κινηματογράφηση</w:t>
+      </w:r>
+      <w:r>
+        <w:rPr>
+          <w:lang w:val="el-GR"/>
+        </w:rPr>
+        <w:t xml:space="preserve">“ </w:t>
+      </w:r>
+      <w:r>
+        <w:rPr>
+          <w:lang w:val="el-GR"/>
+        </w:rPr>
+        <w:t xml:space="preserve">στο </w:t>
       </w:r>
       <w:r>
         <w:t>Silverstone</w:t>
@@ -2057,6 +2345,24 @@
         <w:instrText xml:space="preserve"> INCLUDEPICTURE "https://formula1-data.com/assets/img/uploads/2026/02/williams-unveils-fw48-2026-f1-livery-5.jpg" \* MERGEFORMATINET </w:instrText>
       </w:r>
       <w:r>
+        <w:fldChar w:fldCharType="separate"/>
+      </w:r>
+      <w:r>
+        <w:rPr>
+          <w:noProof/>
+        </w:rPr>
+        <w:fldChar w:fldCharType="begin"/>
+      </w:r>
+      <w:r>
+        <w:rPr>
+          <w:noProof/>
+        </w:rPr>
+        <w:instrText xml:space="preserve"> INCLUDEPICTURE  "https://formula1-data.com/assets/img/uploads/2026/02/williams-unveils-fw48-2026-f1-livery-5.jpg" \* MERGEFORMATINET </w:instrText>
+      </w:r>
+      <w:r>
+        <w:rPr>
+          <w:noProof/>
+        </w:rPr>
         <w:fldChar w:fldCharType="separate"/>
       </w:r>
       <w:r>
@@ -2094,6 +2400,12 @@
         <w:fldChar w:fldCharType="end"/>
       </w:r>
       <w:r>
+        <w:rPr>
+          <w:noProof/>
+        </w:rPr>
+        <w:fldChar w:fldCharType="end"/>
+      </w:r>
+      <w:r>
         <w:fldChar w:fldCharType="end"/>
       </w:r>
     </w:p>
@@ -2377,6 +2689,24 @@
         <w:instrText xml:space="preserve"> INCLUDEPICTURE "https://formula1-data.com/assets/img/uploads/2026/02/williams-unveils-fw48-2026-f1-livery-3.jpg" \* MERGEFORMATINET </w:instrText>
       </w:r>
       <w:r>
+        <w:fldChar w:fldCharType="separate"/>
+      </w:r>
+      <w:r>
+        <w:rPr>
+          <w:noProof/>
+        </w:rPr>
+        <w:fldChar w:fldCharType="begin"/>
+      </w:r>
+      <w:r>
+        <w:rPr>
+          <w:noProof/>
+        </w:rPr>
+        <w:instrText xml:space="preserve"> INCLUDEPICTURE  "https://formula1-data.com/assets/img/uploads/2026/02/williams-unveils-fw48-2026-f1-livery-3.jpg" \* MERGEFORMATINET </w:instrText>
+      </w:r>
+      <w:r>
+        <w:rPr>
+          <w:noProof/>
+        </w:rPr>
         <w:fldChar w:fldCharType="separate"/>
       </w:r>
       <w:r>
@@ -2414,6 +2744,12 @@
         <w:fldChar w:fldCharType="end"/>
       </w:r>
       <w:r>
+        <w:rPr>
+          <w:noProof/>
+        </w:rPr>
+        <w:fldChar w:fldCharType="end"/>
+      </w:r>
+      <w:r>
         <w:fldChar w:fldCharType="end"/>
       </w:r>
     </w:p>
@@ -2480,81 +2816,152 @@
       </w:r>
       <w:r>
         <w:rPr>
+          <w:lang w:val="el-GR"/>
+        </w:rPr>
+        <w:t xml:space="preserve"> με βελτιωμένη ψύξη, ενώ η ανάρτηση και ο σχεδιασμός του δαπέδου βοηθούν στη διαχείριση </w:t>
+      </w:r>
+      <w:r>
+        <w:rPr>
+          <w:lang w:val="el-GR"/>
+        </w:rPr>
+        <w:lastRenderedPageBreak/>
+        <w:t>θερμότητας των ελαστικών. Οι ρυθμίσεις «</w:t>
+      </w:r>
+      <w:r>
+        <w:t>camber</w:t>
+      </w:r>
+      <w:r>
+        <w:rPr>
+          <w:lang w:val="el-GR"/>
+        </w:rPr>
+        <w:t>/</w:t>
+      </w:r>
+      <w:r>
+        <w:t>toe</w:t>
+      </w:r>
+      <w:r>
+        <w:rPr>
+          <w:lang w:val="el-GR"/>
+        </w:rPr>
+        <w:t xml:space="preserve">» και το προσαρμόσιμο βάρος (μπαλαστ) επιτρέπουν αλλαγές στην ισορροπία του αυτοκινήτου στις στροφές. Τα νέα </w:t>
+      </w:r>
+      <w:r>
+        <w:rPr>
           <w:b/>
           <w:bCs/>
           <w:lang w:val="el-GR"/>
         </w:rPr>
+        <w:t>στενότερα ελαστικά</w:t>
+      </w:r>
+      <w:r>
+        <w:rPr>
+          <w:lang w:val="el-GR"/>
+        </w:rPr>
+        <w:t xml:space="preserve"> (25</w:t>
+      </w:r>
+      <w:r>
+        <w:t> mm</w:t>
+      </w:r>
+      <w:r>
+        <w:rPr>
+          <w:lang w:val="el-GR"/>
+        </w:rPr>
+        <w:t xml:space="preserve"> στενότερα εμπρός, 30</w:t>
+      </w:r>
+      <w:r>
+        <w:t> mm</w:t>
+      </w:r>
+      <w:r>
+        <w:rPr>
+          <w:lang w:val="el-GR"/>
+        </w:rPr>
+        <w:t xml:space="preserve"> στενότερα πίσω) μειώνουν την πλευρική επιφάνεια και απαιτούν προσεκτική διαχείριση θερμοκρασίας.</w:t>
+      </w:r>
+    </w:p>
+    <w:p>
+      <w:pPr>
+        <w:pStyle w:val="a0"/>
+        <w:rPr>
+          <w:lang w:val="el-GR"/>
+        </w:rPr>
+      </w:pPr>
+      <w:r>
+        <w:rPr>
+          <w:lang w:val="el-GR"/>
+        </w:rPr>
+        <w:t xml:space="preserve">Η </w:t>
+      </w:r>
+      <w:r>
+        <w:t>Williams</w:t>
+      </w:r>
+      <w:r>
+        <w:rPr>
+          <w:lang w:val="el-GR"/>
+        </w:rPr>
+        <w:t xml:space="preserve"> αξιοποιεί χαρτογράφηση μεταφοράς ενέργειας στα ελαστικά, όπως είχε κάνει στο </w:t>
+      </w:r>
+      <w:r>
+        <w:t>FW</w:t>
+      </w:r>
+      <w:r>
+        <w:rPr>
+          <w:lang w:val="el-GR"/>
+        </w:rPr>
+        <w:t xml:space="preserve">47, ώστε ο οδηγός να ρυθμίζει </w:t>
+      </w:r>
+      <w:r>
+        <w:t>on</w:t>
+      </w:r>
+      <w:r>
+        <w:rPr>
+          <w:lang w:val="el-GR"/>
+        </w:rPr>
         <w:t>‑</w:t>
       </w:r>
       <w:r>
-        <w:rPr>
-          <w:b/>
-          <w:bCs/>
-        </w:rPr>
-        <w:t>carbon</w:t>
-      </w:r>
-      <w:r>
-        <w:rPr>
-          <w:lang w:val="el-GR"/>
-        </w:rPr>
-        <w:t xml:space="preserve"> με βελτιωμένη ψύξη, ενώ η ανάρτηση και ο σχεδιασμός του δαπέδου βοηθούν στη </w:t>
-      </w:r>
-      <w:r>
-        <w:rPr>
-          <w:lang w:val="el-GR"/>
-        </w:rPr>
-        <w:lastRenderedPageBreak/>
-        <w:t>διαχείριση θερμότητας των ελαστικών. Οι ρυθμίσεις «</w:t>
-      </w:r>
-      <w:r>
-        <w:t>camber</w:t>
-      </w:r>
-      <w:r>
-        <w:rPr>
-          <w:lang w:val="el-GR"/>
-        </w:rPr>
-        <w:t>/</w:t>
-      </w:r>
-      <w:r>
-        <w:t>toe</w:t>
-      </w:r>
-      <w:r>
-        <w:rPr>
-          <w:lang w:val="el-GR"/>
-        </w:rPr>
-        <w:t xml:space="preserve">» και το προσαρμόσιμο βάρος (μπαλαστ) επιτρέπουν αλλαγές στην ισορροπία του αυτοκινήτου στις στροφές. Τα νέα </w:t>
-      </w:r>
-      <w:r>
-        <w:rPr>
-          <w:b/>
-          <w:bCs/>
-          <w:lang w:val="el-GR"/>
-        </w:rPr>
-        <w:t>στενότερα ελαστικά</w:t>
-      </w:r>
-      <w:r>
-        <w:rPr>
-          <w:lang w:val="el-GR"/>
-        </w:rPr>
-        <w:t xml:space="preserve"> (25</w:t>
-      </w:r>
-      <w:r>
-        <w:t> mm</w:t>
-      </w:r>
-      <w:r>
-        <w:rPr>
-          <w:lang w:val="el-GR"/>
-        </w:rPr>
-        <w:t xml:space="preserve"> στενότερα εμπρός, 30</w:t>
-      </w:r>
-      <w:r>
-        <w:t> mm</w:t>
-      </w:r>
-      <w:r>
-        <w:rPr>
-          <w:lang w:val="el-GR"/>
-        </w:rPr>
-        <w:t xml:space="preserve"> στενότερα πίσω) μειώνουν την πλευρική επιφάνεια και απαιτούν προσεκτική διαχείριση θερμοκρασίας.</w:t>
+        <w:t>the</w:t>
+      </w:r>
+      <w:r>
+        <w:rPr>
+          <w:lang w:val="el-GR"/>
+        </w:rPr>
+        <w:t>‑</w:t>
+      </w:r>
+      <w:r>
+        <w:t>fly</w:t>
+      </w:r>
+      <w:r>
+        <w:rPr>
+          <w:lang w:val="el-GR"/>
+        </w:rPr>
+        <w:t xml:space="preserve"> την ενέργεια θέρμανσης και να προστατεύει τα </w:t>
+      </w:r>
+      <w:r>
+        <w:t>Pirelli</w:t>
+      </w:r>
+      <w:r>
+        <w:rPr>
+          <w:lang w:val="el-GR"/>
+        </w:rPr>
+        <w:t>. Η κατανομή βάρους μεταβάλλεται με τη θέση των συσσωρευτών και μπαλαστ για την εξισορρόπηση της γωνίας κλίσης (</w:t>
+      </w:r>
+      <w:r>
+        <w:t>yaw</w:t>
+      </w:r>
+      <w:r>
+        <w:rPr>
+          <w:lang w:val="el-GR"/>
+        </w:rPr>
+        <w:t>) και του βυθίσματος (</w:t>
+      </w:r>
+      <w:r>
+        <w:t>pitch</w:t>
+      </w:r>
+      <w:r>
+        <w:rPr>
+          <w:lang w:val="el-GR"/>
+        </w:rPr>
+        <w:t>). Παρά τα περίτεχνα συστήματα, η υπέρβαση βάρους μειώνει την ευελιξία στις ρυθμίσεις και επηρεάζει την κατανομή φορτίου.</w:t>
       </w:r>
     </w:p>
     <w:p>
@@ -2564,84 +2971,6 @@
           <w:lang w:val="el-GR"/>
         </w:rPr>
       </w:pPr>
-      <w:r>
-        <w:rPr>
-          <w:lang w:val="el-GR"/>
-        </w:rPr>
-        <w:t xml:space="preserve">Η </w:t>
-      </w:r>
-      <w:r>
-        <w:t>Williams</w:t>
-      </w:r>
-      <w:r>
-        <w:rPr>
-          <w:lang w:val="el-GR"/>
-        </w:rPr>
-        <w:t xml:space="preserve"> αξιοποιεί χαρτογράφηση μεταφοράς ενέργειας στα ελαστικά, όπως είχε κάνει στο </w:t>
-      </w:r>
-      <w:r>
-        <w:t>FW</w:t>
-      </w:r>
-      <w:r>
-        <w:rPr>
-          <w:lang w:val="el-GR"/>
-        </w:rPr>
-        <w:t xml:space="preserve">47, ώστε ο οδηγός να ρυθμίζει </w:t>
-      </w:r>
-      <w:r>
-        <w:t>on</w:t>
-      </w:r>
-      <w:r>
-        <w:rPr>
-          <w:lang w:val="el-GR"/>
-        </w:rPr>
-        <w:t>‑</w:t>
-      </w:r>
-      <w:r>
-        <w:t>the</w:t>
-      </w:r>
-      <w:r>
-        <w:rPr>
-          <w:lang w:val="el-GR"/>
-        </w:rPr>
-        <w:t>‑</w:t>
-      </w:r>
-      <w:r>
-        <w:t>fly</w:t>
-      </w:r>
-      <w:r>
-        <w:rPr>
-          <w:lang w:val="el-GR"/>
-        </w:rPr>
-        <w:t xml:space="preserve"> την ενέργεια θέρμανσης και να προστατεύει τα </w:t>
-      </w:r>
-      <w:r>
-        <w:t>Pirelli</w:t>
-      </w:r>
-      <w:r>
-        <w:rPr>
-          <w:lang w:val="el-GR"/>
-        </w:rPr>
-        <w:t>. Η κατανομή βάρους μεταβάλλεται με τη θέση των συσσωρευτών και μπαλαστ για την εξισορρόπηση της γωνίας κλίσης (</w:t>
-      </w:r>
-      <w:r>
-        <w:t>yaw</w:t>
-      </w:r>
-      <w:r>
-        <w:rPr>
-          <w:lang w:val="el-GR"/>
-        </w:rPr>
-        <w:t>) και του βυθίσματος (</w:t>
-      </w:r>
-      <w:r>
-        <w:t>pitch</w:t>
-      </w:r>
-      <w:r>
-        <w:rPr>
-          <w:lang w:val="el-GR"/>
-        </w:rPr>
-        <w:t>). Παρά τα περίτεχνα συστήματα, η υπέρβαση βάρους μειώνει την ευελιξία στις ρυθμίσεις και επηρεάζει την κατανομή φορτίου.</w:t>
-      </w:r>
     </w:p>
     <w:p>
       <w:pPr>
@@ -2650,14 +2979,6 @@
           <w:lang w:val="el-GR"/>
         </w:rPr>
       </w:pPr>
-    </w:p>
-    <w:p>
-      <w:pPr>
-        <w:pStyle w:val="a0"/>
-        <w:rPr>
-          <w:lang w:val="el-GR"/>
-        </w:rPr>
-      </w:pPr>
       <w:r>
         <w:fldChar w:fldCharType="begin"/>
       </w:r>
@@ -2665,6 +2986,24 @@
         <w:instrText xml:space="preserve"> INCLUDEPICTURE "https://formula1-data.com/assets/img/uploads/2026/02/williams-unveils-fw48-2026-f1-livery-2.jpg" \* MERGEFORMATINET </w:instrText>
       </w:r>
       <w:r>
+        <w:fldChar w:fldCharType="separate"/>
+      </w:r>
+      <w:r>
+        <w:rPr>
+          <w:noProof/>
+        </w:rPr>
+        <w:fldChar w:fldCharType="begin"/>
+      </w:r>
+      <w:r>
+        <w:rPr>
+          <w:noProof/>
+        </w:rPr>
+        <w:instrText xml:space="preserve"> INCLUDEPICTURE  "https://formula1-data.com/assets/img/uploads/2026/02/williams-unveils-fw48-2026-f1-livery-2.jpg" \* MERGEFORMATINET </w:instrText>
+      </w:r>
+      <w:r>
+        <w:rPr>
+          <w:noProof/>
+        </w:rPr>
         <w:fldChar w:fldCharType="separate"/>
       </w:r>
       <w:r>
@@ -2694,6 +3033,12 @@
             <v:imagedata r:id="rId23" r:href="rId24"/>
           </v:shape>
         </w:pict>
+      </w:r>
+      <w:r>
+        <w:rPr>
+          <w:noProof/>
+        </w:rPr>
+        <w:fldChar w:fldCharType="end"/>
       </w:r>
       <w:r>
         <w:rPr>
@@ -2918,7 +3263,7 @@
                 <w:lang w:val="el-GR"/>
               </w:rPr>
               <w:lastRenderedPageBreak/>
-              <w:t>Μικρότερος, ελαφρύτερος μονοκόκ, επίσημο βάρος 772,4</w:t>
+              <w:t>Μικρότερο, ελαφρύτερο μονοκόκ, επίσημο βάρος 772,4</w:t>
             </w:r>
             <w:r>
               <w:t> kg</w:t>
@@ -2927,14 +3272,14 @@
               <w:rPr>
                 <w:lang w:val="el-GR"/>
               </w:rPr>
-              <w:t xml:space="preserve"> </w:t>
+              <w:t xml:space="preserve"> αλλά </w:t>
             </w:r>
             <w:r>
               <w:rPr>
                 <w:lang w:val="el-GR"/>
               </w:rPr>
               <w:lastRenderedPageBreak/>
-              <w:t>αλλά πιθανές ενισχύσεις οδηγούν σε ~20</w:t>
+              <w:t>πιθανές ενισχύσεις οδηγούν σε ~20</w:t>
             </w:r>
             <w:r>
               <w:t> kg</w:t>
@@ -3585,11 +3930,35 @@
         <w:rPr>
           <w:noProof/>
         </w:rPr>
+        <w:fldChar w:fldCharType="begin"/>
+      </w:r>
+      <w:r>
+        <w:rPr>
+          <w:noProof/>
+        </w:rPr>
+        <w:instrText xml:space="preserve"> INCLUDEPICTURE  "https://formula1-data.com/assets/img/uploads/2026/02/williams-unveils-fw48-2026-f1-livery.jpg" \* MERGEFORMATINET </w:instrText>
+      </w:r>
+      <w:r>
+        <w:rPr>
+          <w:noProof/>
+        </w:rPr>
+        <w:fldChar w:fldCharType="separate"/>
+      </w:r>
+      <w:r>
+        <w:rPr>
+          <w:noProof/>
+        </w:rPr>
         <w:pict>
           <v:shape id="_x0000_i1026" type="#_x0000_t75" alt="ウィリアムズの2025年型F1マシン「FW48」のレースリバリー、2026年2月3日 (1)" style="width:6in;height:269.85pt;mso-width-percent:0;mso-height-percent:0;mso-width-percent:0;mso-height-percent:0">
             <v:imagedata r:id="rId25" r:href="rId26"/>
           </v:shape>
         </w:pict>
+      </w:r>
+      <w:r>
+        <w:rPr>
+          <w:noProof/>
+        </w:rPr>
+        <w:fldChar w:fldCharType="end"/>
       </w:r>
       <w:r>
         <w:rPr>
@@ -3789,7 +4158,7 @@
     <w:p>
       <w:pPr>
         <w:rPr>
-          <w:lang w:val="el-GR"/>
+          <w:lang w:val="de-DE"/>
         </w:rPr>
       </w:pPr>
       <w:r>
@@ -3804,119 +4173,199 @@
         </w:rPr>
         <w:t xml:space="preserve">: </w:t>
       </w:r>
-      <w:r>
+      <w:hyperlink r:id="rId27" w:history="1">
+        <w:r>
+          <w:rPr>
+            <w:rStyle w:val="-"/>
+            <w:lang w:val="de-DE"/>
+          </w:rPr>
+          <w:t>https</w:t>
+        </w:r>
+        <w:r>
+          <w:rPr>
+            <w:rStyle w:val="-"/>
+            <w:lang w:val="el-GR"/>
+          </w:rPr>
+          <w:t>://</w:t>
+        </w:r>
+        <w:r>
+          <w:rPr>
+            <w:rStyle w:val="-"/>
+            <w:lang w:val="de-DE"/>
+          </w:rPr>
+          <w:t>formula</w:t>
+        </w:r>
+        <w:r>
+          <w:rPr>
+            <w:rStyle w:val="-"/>
+            <w:lang w:val="el-GR"/>
+          </w:rPr>
+          <w:t>1-</w:t>
+        </w:r>
+        <w:r>
+          <w:rPr>
+            <w:rStyle w:val="-"/>
+            <w:lang w:val="de-DE"/>
+          </w:rPr>
+          <w:t>data</w:t>
+        </w:r>
+        <w:r>
+          <w:rPr>
+            <w:rStyle w:val="-"/>
+            <w:lang w:val="el-GR"/>
+          </w:rPr>
+          <w:t>.</w:t>
+        </w:r>
+        <w:r>
+          <w:rPr>
+            <w:rStyle w:val="-"/>
+            <w:lang w:val="de-DE"/>
+          </w:rPr>
+          <w:t>com</w:t>
+        </w:r>
+        <w:r>
+          <w:rPr>
+            <w:rStyle w:val="-"/>
+            <w:lang w:val="el-GR"/>
+          </w:rPr>
+          <w:t>/</w:t>
+        </w:r>
+        <w:r>
+          <w:rPr>
+            <w:rStyle w:val="-"/>
+            <w:lang w:val="de-DE"/>
+          </w:rPr>
+          <w:t>article</w:t>
+        </w:r>
+        <w:r>
+          <w:rPr>
+            <w:rStyle w:val="-"/>
+            <w:lang w:val="el-GR"/>
+          </w:rPr>
+          <w:t>/</w:t>
+        </w:r>
+        <w:r>
+          <w:rPr>
+            <w:rStyle w:val="-"/>
+            <w:lang w:val="de-DE"/>
+          </w:rPr>
+          <w:t>williams</w:t>
+        </w:r>
+        <w:r>
+          <w:rPr>
+            <w:rStyle w:val="-"/>
+            <w:lang w:val="el-GR"/>
+          </w:rPr>
+          <w:t>-</w:t>
+        </w:r>
+        <w:r>
+          <w:rPr>
+            <w:rStyle w:val="-"/>
+            <w:lang w:val="de-DE"/>
+          </w:rPr>
+          <w:t>unveils</w:t>
+        </w:r>
+        <w:r>
+          <w:rPr>
+            <w:rStyle w:val="-"/>
+            <w:lang w:val="el-GR"/>
+          </w:rPr>
+          <w:t>-</w:t>
+        </w:r>
+        <w:r>
+          <w:rPr>
+            <w:rStyle w:val="-"/>
+            <w:lang w:val="de-DE"/>
+          </w:rPr>
+          <w:t>fw</w:t>
+        </w:r>
+        <w:r>
+          <w:rPr>
+            <w:rStyle w:val="-"/>
+            <w:lang w:val="el-GR"/>
+          </w:rPr>
+          <w:t>48-2026-</w:t>
+        </w:r>
+        <w:r>
+          <w:rPr>
+            <w:rStyle w:val="-"/>
+            <w:lang w:val="de-DE"/>
+          </w:rPr>
+          <w:t>f</w:t>
+        </w:r>
+        <w:r>
+          <w:rPr>
+            <w:rStyle w:val="-"/>
+            <w:lang w:val="el-GR"/>
+          </w:rPr>
+          <w:t>1-</w:t>
+        </w:r>
+        <w:r>
+          <w:rPr>
+            <w:rStyle w:val="-"/>
+            <w:lang w:val="de-DE"/>
+          </w:rPr>
+          <w:t>livery</w:t>
+        </w:r>
+      </w:hyperlink>
+      <w:r>
+        <w:rPr>
+          <w:lang w:val="el-GR"/>
+        </w:rPr>
+        <w:br/>
+      </w:r>
+      <w:r>
+        <w:rPr>
+          <w:lang w:val="el-GR"/>
+        </w:rPr>
+        <w:br/>
+      </w:r>
+    </w:p>
+    <w:p>
+      <w:pPr>
         <w:rPr>
           <w:lang w:val="de-DE"/>
         </w:rPr>
-        <w:t>https</w:t>
-      </w:r>
-      <w:r>
-        <w:rPr>
-          <w:lang w:val="el-GR"/>
-        </w:rPr>
-        <w:t>://</w:t>
-      </w:r>
+      </w:pPr>
       <w:r>
         <w:rPr>
           <w:lang w:val="de-DE"/>
         </w:rPr>
-        <w:t>formula</w:t>
-      </w:r>
-      <w:r>
-        <w:rPr>
-          <w:lang w:val="el-GR"/>
-        </w:rPr>
-        <w:t>1-</w:t>
+        <w:t>&lt;blockquote class="instagram-media" data-instgrm-captioned data-instgrm-permalink="https://www.instagram.com/p/DWZGhTPmKf_/?utm_source=ig_embe</w:t>
       </w:r>
       <w:r>
         <w:rPr>
           <w:lang w:val="de-DE"/>
         </w:rPr>
-        <w:t>data</w:t>
-      </w:r>
-      <w:r>
-        <w:rPr>
-          <w:lang w:val="el-GR"/>
-        </w:rPr>
-        <w:t>.</w:t>
+        <w:lastRenderedPageBreak/>
+        <w:t xml:space="preserve">d&amp;amp;utm_campaign=loading" data-instgrm-version="14" style=" background:#FFF; border:0; border-radius:3px; box-shadow:0 0 1px 0 rgba(0,0,0,0.5),0 1px 10px 0 rgba(0,0,0,0.15); margin: 1px; max-width:540px; min-width:326px; padding:0; width:99.375%; width:-webkit-calc(100% - 2px); width:calc(100% - 2px);"&gt;&lt;div style="padding:16px;"&gt; &lt;a href="https://www.instagram.com/p/DWZGhTPmKf_/?utm_source=ig_embed&amp;amp;utm_campaign=loading" style=" background:#FFFFFF; line-height:0; padding:0 0; text-align:center; text-decoration:none; width:100%;" target="_blank"&gt; &lt;div style=" display: flex; flex-direction: row; align-items: center;"&gt; &lt;div style="background-color: #F4F4F4; border-radius: 50%; flex-grow: 0; height: 40px; margin-right: 14px; width: 40px;"&gt;&lt;/div&gt; &lt;div style="display: flex; flex-direction: column; flex-grow: 1; justify-content: center;"&gt; &lt;div style=" background-color: #F4F4F4; border-radius: 4px; flex-grow: 0; height: 14px; margin-bottom: 6px; width: 100px;"&gt;&lt;/div&gt; &lt;div style=" background-color: #F4F4F4; border-radius: 4px; flex-grow: 0; height: 14px; width: 60px;"&gt;&lt;/div&gt;&lt;/div&gt;&lt;/div&gt;&lt;div style="padding: 19% 0;"&gt;&lt;/div&gt; &lt;div style="display:block; height:50px; margin:0 auto 12px; width:50px;"&gt;&lt;svg width="50px" height="50px" viewBox="0 0 60 60" version="1.1" xmlns="https://www.w3.org/2000/svg" xmlns:xlink="https://www.w3.org/1999/xlink"&gt;&lt;g stroke="none" stroke-width="1" fill="none" fill-rule="evenodd"&gt;&lt;g transform="translate(-511.000000, -20.000000)" fill="#000000"&gt;&lt;g&gt;&lt;path d="M556.869,30.41 C554.814,30.41 553.148,32.076 553.148,34.131 C553.148,36.186 554.814,37.852 556.869,37.852 C558.924,37.852 560.59,36.186 560.59,34.131 C560.59,32.076 558.924,30.41 556.869,30.41 M541,60.657 C535.114,60.657 530.342,55.887 530.342,50 C530.342,44.114 535.114,39.342 541,39.342 C546.887,39.342 551.658,44.114 551.658,50 C551.658,55.887 546.887,60.657 541,60.657 M541,33.886 C532.1,33.886 524.886,41.1 524.886,50 C524.886,58.899 532.1,66.113 541,66.113 C549.9,66.113 557.115,58.899 557.115,50 C557.115,41.1 549.9,33.886 541,33.886 M565.378,62.101 C565.244,65.022 564.756,66.606 564.346,67.663 C563.803,69.06 563.154,70.057 562.106,71.106 C561.058,72.155 560.06,72.803 558.662,73.347 C557.607,73.757 556.021,74.244 553.102,74.378 C549.944,74.521 548.997,74.552 541,74.552 C533.003,74.552 532.056,74.521 528.898,74.378 C525.979,74.244 524.393,73.757 523.338,73.347 C521.94,72.803 520.942,72.155 519.894,71.106 C518.846,70.057 518.197,69.06 517.654,67.663 C517.244,66.606 516.755,65.022 516.623,62.101 C516.479,58.943 516.448,57.996 516.448,50 C516.448,42.003 516.479,41.056 516.623,37.899 C516.755,34.978 517.244,33.391 517.654,32.338 C518.197,30.938 518.846,29.942 519.894,28.894 C520.942,27.846 521.94,27.196 523.338,26.654 C524.393,26.244 525.979,25.756 528.898,25.623 C532.057,25.479 533.004,25.448 541,25.448 C548.997,25.448 549.943,25.479 553.102,25.623 C556.021,25.756 557.607,26.244 558.662,26.654 C560.06,27.196 561.058,27.846 562.106,28.894 C563.154,29.942 563.803,30.938 564.346,32.338 C564.756,33.391 565.244,34.978 565.378,37.899 C565.522,41.056 565.552,42.003 565.552,50 C565.552,57.996 565.522,58.943 565.378,62.101 M570.82,37.631 C570.674,34.438 570.167,32.258 569.425,30.349 C568.659,28.377 567.633,26.702 </w:t>
       </w:r>
       <w:r>
         <w:rPr>
           <w:lang w:val="de-DE"/>
         </w:rPr>
-        <w:t>com</w:t>
-      </w:r>
-      <w:r>
-        <w:rPr>
-          <w:lang w:val="el-GR"/>
-        </w:rPr>
-        <w:t>/</w:t>
+        <w:lastRenderedPageBreak/>
+        <w:t>565.965,25.035 C564.297,23.368 562.623,22.342 560.652,21.575 C558.743,20.834 556.562,20.326 553.369,20.18 C550.169,20.033 549.148,20 541,20 C532.853,20 531.831,20.033 528.631,20.18 C525.438,20.326 523.257,20.834 521.349,21.575 C519.376,22.342 517.703,23.368 516.035,25.035 C514.368,26.702 513.342,28.377 512.574,30.349 C511.834,32.258 511.326,34.438 511.181,37.631 C511.035,40.831 511,41.851 511,50 C511,58.147 511.035,59.17 511.181,62.369 C511.326,65.562 511.834,67.743 512.574,69.651 C513.342,71.625 514.368,73.296 516.035,74.965 C517.703,76.634 519.376,77.658 521.349,78.425 C523.257,79.167 525.438,79.673 528.631,79.82 C531.831,79.965 532.853,80.001 541,80.001 C549.148,80.001 550.169,79.965 553.369,79.82 C556.562,79.673 558.743,79.167 560.652,78.425 C562.623,77.658 564.297,76.634 565.965,74.965 C567.633,73.296 568.659,71.625 569.425,69.651 C570.167,67.743 570.674,65.562 570.82,62.369 C570.966,59.17 571,58.147 571,50 C571,41.851 570.966,40.831 570.82,37.631"&gt;&lt;/path&gt;&lt;/g&gt;&lt;/g&gt;&lt;/g&gt;&lt;/svg&gt;&lt;/div&gt;&lt;div style="padding-top: 8px;"&gt; &lt;div style=" color:#3897f0; font-family:Arial,sans-serif; font-size:14px; font-style:normal; font-weight:550; line-height:18px;"&gt;Sieh dir diesen Beitrag auf Instagram an&lt;/div&gt;&lt;/div&gt;&lt;div style="padding: 12.5% 0;"&gt;&lt;/div&gt; &lt;div style="display: flex; flex-direction: row; margin-bottom: 14px; align-items: center;"&gt;&lt;div&gt; &lt;div style="background-color: #F4F4F4; border-radius: 50%; height: 12.5px; width: 12.5px; transform: translateX(0px) translateY(7px);"&gt;&lt;/div&gt; &lt;div style="background-color: #F4F4F4; height: 12.5px; transform: rotate(-45deg) translateX(3px) translateY(1px); width: 12.5px; flex-grow: 0; margin-right: 14px; margin-left: 2px;"&gt;&lt;/div&gt; &lt;div style="background-color: #F4F4F4; border-radius: 50%; height: 12.5px; width: 12.5px; transform: translateX(9px) translateY(-18px);"&gt;&lt;/div&gt;&lt;/div&gt;&lt;div style="margin-left: 8px;"&gt; &lt;div style=" background-color: #F4F4F4; border-radius: 50%; flex-grow: 0; height: 20px; width: 20px;"&gt;&lt;/div&gt; &lt;div style=" width: 0; height: 0; border-top: 2px solid transparent; border-left: 6px solid #f4f4f4; border-bottom: 2px solid transparent; transform: translateX(16px) translateY(-4px) rotate(30deg)"&gt;&lt;/div&gt;&lt;/div&gt;&lt;div style="margin-left: auto;"&gt; &lt;div style=" width: 0px; border-top: 8px solid #F4F4F4; border-right: 8px solid transparent; transform: translateY(16px);"&gt;&lt;/div&gt; &lt;div style=" background-color: #F4F4F4; flex-grow: 0; height: 12px; width: 16px; transform: translateY(-4px);"&gt;&lt;/div&gt; &lt;div style=" width: 0; height: 0; border-top: 8px solid #F4F4F4; border-left: 8px solid transparent; transform: translateY(-4px) translateX(8px);"&gt;&lt;/div&gt;&lt;/div&gt;&lt;/div&gt; &lt;div style="display: flex; flex-direction: column; flex-grow: 1; justify-content: center; margin-bottom: 24px;"&gt; &lt;div style=" background-color: #F4F4F4; border-radius: 4px; flex-grow: 0; height: 14px; margin-bottom: 6px; width: 224px;"&gt;&lt;/div&gt; &lt;div style=" background-color: #F4F4F4; border-radius: 4px; flex-grow: 0; height: 14px; width: 144px;"&gt;&lt;/div&gt;&lt;/div&gt;&lt;/a&gt;&lt;p style=" color:#c9c8cd; font-family:Arial,sans-serif; font-size:14px; line-height:17px; margin-bottom:0; margin-top:8px; overflow:hidden; padding:8px 0 7px; text-align:center; text-overflow:ellipsis; white-space:nowrap;"&gt;&lt;a href="https://www.instagram.com/p/DWZGhTPmKf_/?utm_source=ig_embed&amp;amp;utm_campaign=loading" style=" color:#c9c8cd; font-family:Arial,sans-serif; font-</w:t>
       </w:r>
       <w:r>
         <w:rPr>
           <w:lang w:val="de-DE"/>
         </w:rPr>
-        <w:t>article</w:t>
-      </w:r>
-      <w:r>
-        <w:rPr>
-          <w:lang w:val="el-GR"/>
-        </w:rPr>
-        <w:t>/</w:t>
-      </w:r>
-      <w:r>
+        <w:lastRenderedPageBreak/>
+        <w:t>size:14px; font-style:normal; font-weight:normal; line-height:17px; text-decoration:none;" target="_blank"&gt;Ein Beitrag geteilt von Atlassian Williams F1 Team (@williamsf1official)&lt;/a&gt;&lt;/p&gt;&lt;/div&gt;&lt;/blockquote&gt;</w:t>
+      </w:r>
+    </w:p>
+    <w:p>
+      <w:pPr>
         <w:rPr>
           <w:lang w:val="de-DE"/>
         </w:rPr>
-        <w:t>williams</w:t>
-      </w:r>
-      <w:r>
-        <w:rPr>
-          <w:lang w:val="el-GR"/>
-        </w:rPr>
-        <w:t>-</w:t>
-      </w:r>
+      </w:pPr>
       <w:r>
         <w:rPr>
           <w:lang w:val="de-DE"/>
         </w:rPr>
-        <w:t>unveils</w:t>
-      </w:r>
-      <w:r>
-        <w:rPr>
-          <w:lang w:val="el-GR"/>
-        </w:rPr>
-        <w:t>-</w:t>
-      </w:r>
-      <w:r>
-        <w:rPr>
-          <w:lang w:val="de-DE"/>
-        </w:rPr>
-        <w:t>fw</w:t>
-      </w:r>
-      <w:r>
-        <w:rPr>
-          <w:lang w:val="el-GR"/>
-        </w:rPr>
-        <w:t>48-2026-</w:t>
-      </w:r>
-      <w:r>
-        <w:rPr>
-          <w:lang w:val="de-DE"/>
-        </w:rPr>
-        <w:t>f</w:t>
-      </w:r>
-      <w:r>
-        <w:rPr>
-          <w:lang w:val="el-GR"/>
-        </w:rPr>
-        <w:t>1-</w:t>
-      </w:r>
-      <w:r>
-        <w:rPr>
-          <w:lang w:val="de-DE"/>
-        </w:rPr>
-        <w:t>livery</w:t>
+        <w:t>&lt;script async src="//www.instagram.com/embed.js"&gt;&lt;/script&gt;</w:t>
       </w:r>
     </w:p>
     <w:sectPr>
@@ -5224,6 +5673,18 @@
     <w:rPr>
       <w:rFonts w:ascii="Consolas" w:hAnsi="Consolas"/>
       <w:sz w:val="22"/>
+    </w:rPr>
+  </w:style>
+  <w:style w:type="character" w:styleId="ad">
+    <w:name w:val="Unresolved Mention"/>
+    <w:basedOn w:val="a1"/>
+    <w:uiPriority w:val="99"/>
+    <w:semiHidden/>
+    <w:unhideWhenUsed/>
+    <w:rsid w:val="003B2035"/>
+    <w:rPr>
+      <w:color w:val="605E5C"/>
+      <w:shd w:val="clear" w:color="auto" w:fill="E1DFDD"/>
     </w:rPr>
   </w:style>
 </w:styles>

</xml_diff>

<commit_message>
2Fast new article + Quali Gaps in standings.html
</commit_message>
<xml_diff>
--- a/blog-module/blog-entries/20260402G/Τεχνική Ανάλυση FW48 2026.docx
+++ b/blog-module/blog-entries/20260402G/Τεχνική Ανάλυση FW48 2026.docx
@@ -49,7 +49,7 @@
         <w:rPr>
           <w:lang w:val="el-GR"/>
         </w:rPr>
-        <w:t xml:space="preserve">Αναλυτική Τεχνική Παρουσίαση του </w:t>
+        <w:t xml:space="preserve">Τεχνική Παρουσίαση του </w:t>
       </w:r>
       <w:r>
         <w:t>Williams</w:t>
@@ -190,6 +190,24 @@
         <w:instrText xml:space="preserve"> INCLUDEPICTURE "https://formula1-data.com/assets/img/uploads/2026/02/williams-unveils-fw48-2026-f1-livery-9.jpg" \* MERGEFORMATINET </w:instrText>
       </w:r>
       <w:r>
+        <w:fldChar w:fldCharType="separate"/>
+      </w:r>
+      <w:r>
+        <w:rPr>
+          <w:noProof/>
+        </w:rPr>
+        <w:fldChar w:fldCharType="begin"/>
+      </w:r>
+      <w:r>
+        <w:rPr>
+          <w:noProof/>
+        </w:rPr>
+        <w:instrText xml:space="preserve"> INCLUDEPICTURE  "https://formula1-data.com/assets/img/uploads/2026/02/williams-unveils-fw48-2026-f1-livery-9.jpg" \* MERGEFORMATINET </w:instrText>
+      </w:r>
+      <w:r>
+        <w:rPr>
+          <w:noProof/>
+        </w:rPr>
         <w:fldChar w:fldCharType="separate"/>
       </w:r>
       <w:r>
@@ -270,6 +288,12 @@
         <w:fldChar w:fldCharType="end"/>
       </w:r>
       <w:r>
+        <w:rPr>
+          <w:noProof/>
+        </w:rPr>
+        <w:fldChar w:fldCharType="end"/>
+      </w:r>
+      <w:r>
         <w:fldChar w:fldCharType="end"/>
       </w:r>
     </w:p>
@@ -548,6 +572,24 @@
         <w:rPr>
           <w:noProof/>
         </w:rPr>
+        <w:fldChar w:fldCharType="begin"/>
+      </w:r>
+      <w:r>
+        <w:rPr>
+          <w:noProof/>
+        </w:rPr>
+        <w:instrText xml:space="preserve"> INCLUDEPICTURE  "https://formula1-data.com/assets/img/uploads/2026/02/williams-unveils-fw48-2026-f1-livery-11.jpg" \* MERGEFORMATINET </w:instrText>
+      </w:r>
+      <w:r>
+        <w:rPr>
+          <w:noProof/>
+        </w:rPr>
+        <w:fldChar w:fldCharType="separate"/>
+      </w:r>
+      <w:r>
+        <w:rPr>
+          <w:noProof/>
+        </w:rPr>
         <w:pict>
           <v:shape id="_x0000_i1035" type="#_x0000_t75" alt="ウィリアムズの2025年型F1マシン「FW48」のレースリバリー、2026年2月3日 (12)" style="width:6in;height:269.85pt;mso-width-percent:0;mso-height-percent:0;mso-width-percent:0;mso-height-percent:0">
             <v:imagedata r:id="rId7" r:href="rId8"/>
@@ -567,6 +609,12 @@
         <w:fldChar w:fldCharType="end"/>
       </w:r>
       <w:r>
+        <w:rPr>
+          <w:noProof/>
+        </w:rPr>
+        <w:fldChar w:fldCharType="end"/>
+      </w:r>
+      <w:r>
         <w:fldChar w:fldCharType="end"/>
       </w:r>
     </w:p>
@@ -635,6 +683,24 @@
         <w:rPr>
           <w:noProof/>
         </w:rPr>
+        <w:fldChar w:fldCharType="begin"/>
+      </w:r>
+      <w:r>
+        <w:rPr>
+          <w:noProof/>
+        </w:rPr>
+        <w:instrText xml:space="preserve"> INCLUDEPICTURE  "https://formula1-data.com/assets/img/uploads/2026/02/williams-unveils-fw48-2026-f1-livery-10.jpg" \* MERGEFORMATINET </w:instrText>
+      </w:r>
+      <w:r>
+        <w:rPr>
+          <w:noProof/>
+        </w:rPr>
+        <w:fldChar w:fldCharType="separate"/>
+      </w:r>
+      <w:r>
+        <w:rPr>
+          <w:noProof/>
+        </w:rPr>
         <w:pict>
           <v:shape id="_x0000_i1034" type="#_x0000_t75" alt="ウィリアムズの2025年型F1マシン「FW48」のレースリバリー、2026年2月3日 (11)" style="width:6in;height:269.85pt;mso-width-percent:0;mso-height-percent:0;mso-width-percent:0;mso-height-percent:0">
             <v:imagedata r:id="rId9" r:href="rId10"/>
@@ -654,6 +720,12 @@
         <w:fldChar w:fldCharType="end"/>
       </w:r>
       <w:r>
+        <w:rPr>
+          <w:noProof/>
+        </w:rPr>
+        <w:fldChar w:fldCharType="end"/>
+      </w:r>
+      <w:r>
         <w:fldChar w:fldCharType="end"/>
       </w:r>
     </w:p>
@@ -956,6 +1028,24 @@
         <w:rPr>
           <w:noProof/>
         </w:rPr>
+        <w:fldChar w:fldCharType="begin"/>
+      </w:r>
+      <w:r>
+        <w:rPr>
+          <w:noProof/>
+        </w:rPr>
+        <w:instrText xml:space="preserve"> INCLUDEPICTURE  "https://formula1-data.com/assets/img/uploads/2026/02/williams-unveils-fw48-2026-f1-livery-12.jpg" \* MERGEFORMATINET </w:instrText>
+      </w:r>
+      <w:r>
+        <w:rPr>
+          <w:noProof/>
+        </w:rPr>
+        <w:fldChar w:fldCharType="separate"/>
+      </w:r>
+      <w:r>
+        <w:rPr>
+          <w:noProof/>
+        </w:rPr>
         <w:pict>
           <v:shape id="_x0000_i1033" type="#_x0000_t75" alt="ウィリアムズの2025年型F1マシン「FW48」のレースリバリー、2026年2月3日 (13)" style="width:6in;height:269.85pt;mso-width-percent:0;mso-height-percent:0;mso-width-percent:0;mso-height-percent:0">
             <v:imagedata r:id="rId11" r:href="rId12"/>
@@ -975,6 +1065,12 @@
         <w:fldChar w:fldCharType="end"/>
       </w:r>
       <w:r>
+        <w:rPr>
+          <w:noProof/>
+        </w:rPr>
+        <w:fldChar w:fldCharType="end"/>
+      </w:r>
+      <w:r>
         <w:fldChar w:fldCharType="end"/>
       </w:r>
     </w:p>
@@ -1386,6 +1482,24 @@
         <w:rPr>
           <w:noProof/>
         </w:rPr>
+        <w:fldChar w:fldCharType="begin"/>
+      </w:r>
+      <w:r>
+        <w:rPr>
+          <w:noProof/>
+        </w:rPr>
+        <w:instrText xml:space="preserve"> INCLUDEPICTURE  "https://formula1-data.com/assets/img/uploads/2026/02/williams-unveils-fw48-2026-f1-livery-8.jpg" \* MERGEFORMATINET </w:instrText>
+      </w:r>
+      <w:r>
+        <w:rPr>
+          <w:noProof/>
+        </w:rPr>
+        <w:fldChar w:fldCharType="separate"/>
+      </w:r>
+      <w:r>
+        <w:rPr>
+          <w:noProof/>
+        </w:rPr>
         <w:pict>
           <v:shape id="_x0000_i1032" type="#_x0000_t75" alt="ウィリアムズの2025年型F1マシン「FW48」のレースリバリー、2026年2月3日 (9)" style="width:6in;height:269.85pt;mso-width-percent:0;mso-height-percent:0;mso-width-percent:0;mso-height-percent:0">
             <v:imagedata r:id="rId13" r:href="rId14"/>
@@ -1405,6 +1519,12 @@
         <w:fldChar w:fldCharType="end"/>
       </w:r>
       <w:r>
+        <w:rPr>
+          <w:noProof/>
+        </w:rPr>
+        <w:fldChar w:fldCharType="end"/>
+      </w:r>
+      <w:r>
         <w:fldChar w:fldCharType="end"/>
       </w:r>
     </w:p>
@@ -1472,6 +1592,24 @@
         <w:rPr>
           <w:noProof/>
         </w:rPr>
+        <w:fldChar w:fldCharType="begin"/>
+      </w:r>
+      <w:r>
+        <w:rPr>
+          <w:noProof/>
+        </w:rPr>
+        <w:instrText xml:space="preserve"> INCLUDEPICTURE  "https://formula1-data.com/assets/img/uploads/2026/02/williams-unveils-fw48-2026-f1-livery-7.jpg" \* MERGEFORMATINET </w:instrText>
+      </w:r>
+      <w:r>
+        <w:rPr>
+          <w:noProof/>
+        </w:rPr>
+        <w:fldChar w:fldCharType="separate"/>
+      </w:r>
+      <w:r>
+        <w:rPr>
+          <w:noProof/>
+        </w:rPr>
         <w:pict>
           <v:shape id="_x0000_i1031" type="#_x0000_t75" alt="ウィリアムズの2025年型F1マシン「FW48」のレースリバリー、2026年2月3日 (8)" style="width:6in;height:269.85pt;mso-width-percent:0;mso-height-percent:0;mso-width-percent:0;mso-height-percent:0">
             <v:imagedata r:id="rId15" r:href="rId16"/>
@@ -1491,6 +1629,12 @@
         <w:fldChar w:fldCharType="end"/>
       </w:r>
       <w:r>
+        <w:rPr>
+          <w:noProof/>
+        </w:rPr>
+        <w:fldChar w:fldCharType="end"/>
+      </w:r>
+      <w:r>
         <w:fldChar w:fldCharType="end"/>
       </w:r>
     </w:p>
@@ -1873,6 +2017,24 @@
         <w:rPr>
           <w:noProof/>
         </w:rPr>
+        <w:fldChar w:fldCharType="begin"/>
+      </w:r>
+      <w:r>
+        <w:rPr>
+          <w:noProof/>
+        </w:rPr>
+        <w:instrText xml:space="preserve"> INCLUDEPICTURE  "https://formula1-data.com/assets/img/uploads/2026/02/williams-unveils-fw48-2026-f1-livery-6.jpg" \* MERGEFORMATINET </w:instrText>
+      </w:r>
+      <w:r>
+        <w:rPr>
+          <w:noProof/>
+        </w:rPr>
+        <w:fldChar w:fldCharType="separate"/>
+      </w:r>
+      <w:r>
+        <w:rPr>
+          <w:noProof/>
+        </w:rPr>
         <w:pict>
           <v:shape id="_x0000_i1030" type="#_x0000_t75" alt="ウィリアムズの2025年型F1マシン「FW48」のレースリバリー、2026年2月3日 (7)" style="width:6in;height:269.85pt;mso-width-percent:0;mso-height-percent:0;mso-width-percent:0;mso-height-percent:0">
             <v:imagedata r:id="rId17" r:href="rId18"/>
@@ -1892,6 +2054,12 @@
         <w:fldChar w:fldCharType="end"/>
       </w:r>
       <w:r>
+        <w:rPr>
+          <w:noProof/>
+        </w:rPr>
+        <w:fldChar w:fldCharType="end"/>
+      </w:r>
+      <w:r>
         <w:fldChar w:fldCharType="end"/>
       </w:r>
     </w:p>
@@ -2387,6 +2555,24 @@
         <w:rPr>
           <w:noProof/>
         </w:rPr>
+        <w:fldChar w:fldCharType="begin"/>
+      </w:r>
+      <w:r>
+        <w:rPr>
+          <w:noProof/>
+        </w:rPr>
+        <w:instrText xml:space="preserve"> INCLUDEPICTURE  "https://formula1-data.com/assets/img/uploads/2026/02/williams-unveils-fw48-2026-f1-livery-5.jpg" \* MERGEFORMATINET </w:instrText>
+      </w:r>
+      <w:r>
+        <w:rPr>
+          <w:noProof/>
+        </w:rPr>
+        <w:fldChar w:fldCharType="separate"/>
+      </w:r>
+      <w:r>
+        <w:rPr>
+          <w:noProof/>
+        </w:rPr>
         <w:pict>
           <v:shape id="_x0000_i1029" type="#_x0000_t75" alt="ウィリアムズの2025年型F1マシン「FW48」のレースリバリー、2026年2月3日 (6)" style="width:6in;height:269.85pt;mso-width-percent:0;mso-height-percent:0;mso-width-percent:0;mso-height-percent:0">
             <v:imagedata r:id="rId19" r:href="rId20"/>
@@ -2406,6 +2592,12 @@
         <w:fldChar w:fldCharType="end"/>
       </w:r>
       <w:r>
+        <w:rPr>
+          <w:noProof/>
+        </w:rPr>
+        <w:fldChar w:fldCharType="end"/>
+      </w:r>
+      <w:r>
         <w:fldChar w:fldCharType="end"/>
       </w:r>
     </w:p>
@@ -2731,6 +2923,24 @@
         <w:rPr>
           <w:noProof/>
         </w:rPr>
+        <w:fldChar w:fldCharType="begin"/>
+      </w:r>
+      <w:r>
+        <w:rPr>
+          <w:noProof/>
+        </w:rPr>
+        <w:instrText xml:space="preserve"> INCLUDEPICTURE  "https://formula1-data.com/assets/img/uploads/2026/02/williams-unveils-fw48-2026-f1-livery-3.jpg" \* MERGEFORMATINET </w:instrText>
+      </w:r>
+      <w:r>
+        <w:rPr>
+          <w:noProof/>
+        </w:rPr>
+        <w:fldChar w:fldCharType="separate"/>
+      </w:r>
+      <w:r>
+        <w:rPr>
+          <w:noProof/>
+        </w:rPr>
         <w:pict>
           <v:shape id="_x0000_i1028" type="#_x0000_t75" alt="ウィリアムズの2025年型F1マシン「FW48」のレースリバリー、2026年2月3日 (4)" style="width:6in;height:269.85pt;mso-width-percent:0;mso-height-percent:0;mso-width-percent:0;mso-height-percent:0">
             <v:imagedata r:id="rId21" r:href="rId22"/>
@@ -2750,6 +2960,12 @@
         <w:fldChar w:fldCharType="end"/>
       </w:r>
       <w:r>
+        <w:rPr>
+          <w:noProof/>
+        </w:rPr>
+        <w:fldChar w:fldCharType="end"/>
+      </w:r>
+      <w:r>
         <w:fldChar w:fldCharType="end"/>
       </w:r>
     </w:p>
@@ -3028,11 +3244,35 @@
         <w:rPr>
           <w:noProof/>
         </w:rPr>
+        <w:fldChar w:fldCharType="begin"/>
+      </w:r>
+      <w:r>
+        <w:rPr>
+          <w:noProof/>
+        </w:rPr>
+        <w:instrText xml:space="preserve"> INCLUDEPICTURE  "https://formula1-data.com/assets/img/uploads/2026/02/williams-unveils-fw48-2026-f1-livery-2.jpg" \* MERGEFORMATINET </w:instrText>
+      </w:r>
+      <w:r>
+        <w:rPr>
+          <w:noProof/>
+        </w:rPr>
+        <w:fldChar w:fldCharType="separate"/>
+      </w:r>
+      <w:r>
+        <w:rPr>
+          <w:noProof/>
+        </w:rPr>
         <w:pict>
           <v:shape id="_x0000_i1027" type="#_x0000_t75" alt="ウィリアムズの2025年型F1マシン「FW48」のレースリバリー、2026年2月3日 (3)" style="width:6in;height:269.85pt;mso-width-percent:0;mso-height-percent:0;mso-width-percent:0;mso-height-percent:0">
             <v:imagedata r:id="rId23" r:href="rId24"/>
           </v:shape>
         </w:pict>
+      </w:r>
+      <w:r>
+        <w:rPr>
+          <w:noProof/>
+        </w:rPr>
+        <w:fldChar w:fldCharType="end"/>
       </w:r>
       <w:r>
         <w:rPr>
@@ -3948,11 +4188,35 @@
         <w:rPr>
           <w:noProof/>
         </w:rPr>
+        <w:fldChar w:fldCharType="begin"/>
+      </w:r>
+      <w:r>
+        <w:rPr>
+          <w:noProof/>
+        </w:rPr>
+        <w:instrText xml:space="preserve"> INCLUDEPICTURE  "https://formula1-data.com/assets/img/uploads/2026/02/williams-unveils-fw48-2026-f1-livery.jpg" \* MERGEFORMATINET </w:instrText>
+      </w:r>
+      <w:r>
+        <w:rPr>
+          <w:noProof/>
+        </w:rPr>
+        <w:fldChar w:fldCharType="separate"/>
+      </w:r>
+      <w:r>
+        <w:rPr>
+          <w:noProof/>
+        </w:rPr>
         <w:pict>
           <v:shape id="_x0000_i1026" type="#_x0000_t75" alt="ウィリアムズの2025年型F1マシン「FW48」のレースリバリー、2026年2月3日 (1)" style="width:6in;height:269.85pt;mso-width-percent:0;mso-height-percent:0;mso-width-percent:0;mso-height-percent:0">
             <v:imagedata r:id="rId25" r:href="rId26"/>
           </v:shape>
         </w:pict>
+      </w:r>
+      <w:r>
+        <w:rPr>
+          <w:noProof/>
+        </w:rPr>
+        <w:fldChar w:fldCharType="end"/>
       </w:r>
       <w:r>
         <w:rPr>
@@ -4158,7 +4422,7 @@
     <w:p>
       <w:pPr>
         <w:rPr>
-          <w:lang w:val="de-DE"/>
+          <w:lang w:val="el-GR"/>
         </w:rPr>
       </w:pPr>
       <w:r>
@@ -4329,16 +4593,3130 @@
       </w:pPr>
       <w:r>
         <w:rPr>
-          <w:lang w:val="de-DE"/>
-        </w:rPr>
-        <w:t>&lt;blockquote class="instagram-media" data-instgrm-captioned data-instgrm-permalink="https://www.instagram.com/p/DWZGhTPmKf_/?utm_source=ig_embe</w:t>
+          <w:lang w:val="el-GR"/>
+        </w:rPr>
+        <w:t>&lt;</w:t>
+      </w:r>
+      <w:r>
+        <w:rPr>
+          <w:lang w:val="de-DE"/>
+        </w:rPr>
+        <w:t>blockquote</w:t>
+      </w:r>
+      <w:r>
+        <w:rPr>
+          <w:lang w:val="el-GR"/>
+        </w:rPr>
+        <w:t xml:space="preserve"> </w:t>
+      </w:r>
+      <w:r>
+        <w:rPr>
+          <w:lang w:val="de-DE"/>
+        </w:rPr>
+        <w:t>class</w:t>
+      </w:r>
+      <w:r>
+        <w:rPr>
+          <w:lang w:val="el-GR"/>
+        </w:rPr>
+        <w:t>="</w:t>
+      </w:r>
+      <w:r>
+        <w:rPr>
+          <w:lang w:val="de-DE"/>
+        </w:rPr>
+        <w:t>instagram</w:t>
+      </w:r>
+      <w:r>
+        <w:rPr>
+          <w:lang w:val="el-GR"/>
+        </w:rPr>
+        <w:t>-</w:t>
+      </w:r>
+      <w:r>
+        <w:rPr>
+          <w:lang w:val="de-DE"/>
+        </w:rPr>
+        <w:t>media</w:t>
+      </w:r>
+      <w:r>
+        <w:rPr>
+          <w:lang w:val="el-GR"/>
+        </w:rPr>
+        <w:t xml:space="preserve">" </w:t>
+      </w:r>
+      <w:r>
+        <w:rPr>
+          <w:lang w:val="de-DE"/>
+        </w:rPr>
+        <w:t>data</w:t>
+      </w:r>
+      <w:r>
+        <w:rPr>
+          <w:lang w:val="el-GR"/>
+        </w:rPr>
+        <w:t>-</w:t>
+      </w:r>
+      <w:r>
+        <w:rPr>
+          <w:lang w:val="de-DE"/>
+        </w:rPr>
+        <w:t>instgrm</w:t>
+      </w:r>
+      <w:r>
+        <w:rPr>
+          <w:lang w:val="el-GR"/>
+        </w:rPr>
+        <w:t>-</w:t>
+      </w:r>
+      <w:r>
+        <w:rPr>
+          <w:lang w:val="de-DE"/>
+        </w:rPr>
+        <w:t>captioned</w:t>
+      </w:r>
+      <w:r>
+        <w:rPr>
+          <w:lang w:val="el-GR"/>
+        </w:rPr>
+        <w:t xml:space="preserve"> </w:t>
+      </w:r>
+      <w:r>
+        <w:rPr>
+          <w:lang w:val="de-DE"/>
+        </w:rPr>
+        <w:t>data</w:t>
+      </w:r>
+      <w:r>
+        <w:rPr>
+          <w:lang w:val="el-GR"/>
+        </w:rPr>
+        <w:t>-</w:t>
+      </w:r>
+      <w:r>
+        <w:rPr>
+          <w:lang w:val="de-DE"/>
+        </w:rPr>
+        <w:t>instgrm</w:t>
+      </w:r>
+      <w:r>
+        <w:rPr>
+          <w:lang w:val="el-GR"/>
+        </w:rPr>
+        <w:t>-</w:t>
+      </w:r>
+      <w:r>
+        <w:rPr>
+          <w:lang w:val="de-DE"/>
+        </w:rPr>
+        <w:t>permalink</w:t>
+      </w:r>
+      <w:r>
+        <w:rPr>
+          <w:lang w:val="el-GR"/>
+        </w:rPr>
+        <w:t>="</w:t>
+      </w:r>
+      <w:r>
+        <w:rPr>
+          <w:lang w:val="de-DE"/>
+        </w:rPr>
+        <w:t>https</w:t>
+      </w:r>
+      <w:r>
+        <w:rPr>
+          <w:lang w:val="el-GR"/>
+        </w:rPr>
+        <w:t>://</w:t>
+      </w:r>
+      <w:r>
+        <w:rPr>
+          <w:lang w:val="de-DE"/>
+        </w:rPr>
+        <w:t>www</w:t>
+      </w:r>
+      <w:r>
+        <w:rPr>
+          <w:lang w:val="el-GR"/>
+        </w:rPr>
+        <w:t>.</w:t>
+      </w:r>
+      <w:r>
+        <w:rPr>
+          <w:lang w:val="de-DE"/>
+        </w:rPr>
+        <w:t>instagram</w:t>
+      </w:r>
+      <w:r>
+        <w:rPr>
+          <w:lang w:val="el-GR"/>
+        </w:rPr>
+        <w:t>.</w:t>
+      </w:r>
+      <w:r>
+        <w:rPr>
+          <w:lang w:val="de-DE"/>
+        </w:rPr>
+        <w:t>com</w:t>
+      </w:r>
+      <w:r>
+        <w:rPr>
+          <w:lang w:val="el-GR"/>
+        </w:rPr>
+        <w:t>/</w:t>
+      </w:r>
+      <w:r>
+        <w:rPr>
+          <w:lang w:val="de-DE"/>
+        </w:rPr>
+        <w:t>p</w:t>
+      </w:r>
+      <w:r>
+        <w:rPr>
+          <w:lang w:val="el-GR"/>
+        </w:rPr>
+        <w:t>/</w:t>
+      </w:r>
+      <w:r>
+        <w:rPr>
+          <w:lang w:val="de-DE"/>
+        </w:rPr>
+        <w:t>DWZGhTPmKf</w:t>
+      </w:r>
+      <w:r>
+        <w:rPr>
+          <w:lang w:val="el-GR"/>
+        </w:rPr>
+        <w:t>_/?</w:t>
+      </w:r>
+      <w:r>
+        <w:rPr>
+          <w:lang w:val="de-DE"/>
+        </w:rPr>
+        <w:t>utm</w:t>
+      </w:r>
+      <w:r>
+        <w:rPr>
+          <w:lang w:val="el-GR"/>
+        </w:rPr>
+        <w:t>_</w:t>
+      </w:r>
+      <w:r>
+        <w:rPr>
+          <w:lang w:val="de-DE"/>
+        </w:rPr>
+        <w:t>source</w:t>
+      </w:r>
+      <w:r>
+        <w:rPr>
+          <w:lang w:val="el-GR"/>
+        </w:rPr>
+        <w:t>=</w:t>
+      </w:r>
+      <w:r>
+        <w:rPr>
+          <w:lang w:val="de-DE"/>
+        </w:rPr>
+        <w:t>ig</w:t>
+      </w:r>
+      <w:r>
+        <w:rPr>
+          <w:lang w:val="el-GR"/>
+        </w:rPr>
+        <w:t>_</w:t>
+      </w:r>
+      <w:r>
+        <w:rPr>
+          <w:lang w:val="de-DE"/>
+        </w:rPr>
+        <w:t>embe</w:t>
       </w:r>
       <w:r>
         <w:rPr>
           <w:lang w:val="de-DE"/>
         </w:rPr>
         <w:lastRenderedPageBreak/>
-        <w:t xml:space="preserve">d&amp;amp;utm_campaign=loading" data-instgrm-version="14" style=" background:#FFF; border:0; border-radius:3px; box-shadow:0 0 1px 0 rgba(0,0,0,0.5),0 1px 10px 0 rgba(0,0,0,0.15); margin: 1px; max-width:540px; min-width:326px; padding:0; width:99.375%; width:-webkit-calc(100% - 2px); width:calc(100% - 2px);"&gt;&lt;div style="padding:16px;"&gt; &lt;a href="https://www.instagram.com/p/DWZGhTPmKf_/?utm_source=ig_embed&amp;amp;utm_campaign=loading" style=" background:#FFFFFF; line-height:0; padding:0 0; text-align:center; text-decoration:none; width:100%;" target="_blank"&gt; &lt;div style=" display: flex; flex-direction: row; align-items: center;"&gt; &lt;div style="background-color: #F4F4F4; border-radius: 50%; flex-grow: 0; height: 40px; margin-right: 14px; width: 40px;"&gt;&lt;/div&gt; &lt;div style="display: flex; flex-direction: column; flex-grow: 1; justify-content: center;"&gt; &lt;div style=" background-color: #F4F4F4; border-radius: 4px; flex-grow: 0; height: 14px; margin-bottom: 6px; width: 100px;"&gt;&lt;/div&gt; &lt;div style=" background-color: #F4F4F4; border-radius: 4px; flex-grow: 0; height: 14px; width: 60px;"&gt;&lt;/div&gt;&lt;/div&gt;&lt;/div&gt;&lt;div style="padding: 19% 0;"&gt;&lt;/div&gt; &lt;div style="display:block; height:50px; margin:0 auto 12px; width:50px;"&gt;&lt;svg width="50px" height="50px" viewBox="0 0 60 60" version="1.1" xmlns="https://www.w3.org/2000/svg" xmlns:xlink="https://www.w3.org/1999/xlink"&gt;&lt;g stroke="none" stroke-width="1" fill="none" fill-rule="evenodd"&gt;&lt;g transform="translate(-511.000000, -20.000000)" fill="#000000"&gt;&lt;g&gt;&lt;path d="M556.869,30.41 C554.814,30.41 553.148,32.076 553.148,34.131 C553.148,36.186 554.814,37.852 556.869,37.852 C558.924,37.852 560.59,36.186 560.59,34.131 C560.59,32.076 558.924,30.41 556.869,30.41 M541,60.657 C535.114,60.657 530.342,55.887 530.342,50 C530.342,44.114 535.114,39.342 541,39.342 C546.887,39.342 551.658,44.114 551.658,50 C551.658,55.887 546.887,60.657 541,60.657 M541,33.886 C532.1,33.886 524.886,41.1 524.886,50 C524.886,58.899 532.1,66.113 541,66.113 C549.9,66.113 557.115,58.899 557.115,50 C557.115,41.1 549.9,33.886 541,33.886 M565.378,62.101 C565.244,65.022 564.756,66.606 564.346,67.663 C563.803,69.06 563.154,70.057 562.106,71.106 C561.058,72.155 560.06,72.803 558.662,73.347 C557.607,73.757 556.021,74.244 553.102,74.378 C549.944,74.521 548.997,74.552 541,74.552 C533.003,74.552 532.056,74.521 528.898,74.378 C525.979,74.244 524.393,73.757 523.338,73.347 C521.94,72.803 520.942,72.155 519.894,71.106 C518.846,70.057 518.197,69.06 517.654,67.663 C517.244,66.606 516.755,65.022 516.623,62.101 C516.479,58.943 516.448,57.996 516.448,50 C516.448,42.003 516.479,41.056 516.623,37.899 C516.755,34.978 517.244,33.391 517.654,32.338 C518.197,30.938 518.846,29.942 519.894,28.894 C520.942,27.846 521.94,27.196 523.338,26.654 C524.393,26.244 525.979,25.756 528.898,25.623 C532.057,25.479 533.004,25.448 541,25.448 C548.997,25.448 549.943,25.479 553.102,25.623 C556.021,25.756 557.607,26.244 558.662,26.654 C560.06,27.196 561.058,27.846 562.106,28.894 C563.154,29.942 563.803,30.938 564.346,32.338 C564.756,33.391 565.244,34.978 565.378,37.899 C565.522,41.056 565.552,42.003 565.552,50 C565.552,57.996 565.522,58.943 565.378,62.101 M570.82,37.631 C570.674,34.438 570.167,32.258 569.425,30.349 C568.659,28.377 567.633,26.702 </w:t>
+        <w:t>d</w:t>
+      </w:r>
+      <w:r>
+        <w:rPr>
+          <w:lang w:val="el-GR"/>
+        </w:rPr>
+        <w:t>&amp;</w:t>
+      </w:r>
+      <w:r>
+        <w:rPr>
+          <w:lang w:val="de-DE"/>
+        </w:rPr>
+        <w:t>amp</w:t>
+      </w:r>
+      <w:r>
+        <w:rPr>
+          <w:lang w:val="el-GR"/>
+        </w:rPr>
+        <w:t>;</w:t>
+      </w:r>
+      <w:r>
+        <w:rPr>
+          <w:lang w:val="de-DE"/>
+        </w:rPr>
+        <w:t>utm</w:t>
+      </w:r>
+      <w:r>
+        <w:rPr>
+          <w:lang w:val="el-GR"/>
+        </w:rPr>
+        <w:t>_</w:t>
+      </w:r>
+      <w:r>
+        <w:rPr>
+          <w:lang w:val="de-DE"/>
+        </w:rPr>
+        <w:t>campaign</w:t>
+      </w:r>
+      <w:r>
+        <w:rPr>
+          <w:lang w:val="el-GR"/>
+        </w:rPr>
+        <w:t>=</w:t>
+      </w:r>
+      <w:r>
+        <w:rPr>
+          <w:lang w:val="de-DE"/>
+        </w:rPr>
+        <w:t>loading</w:t>
+      </w:r>
+      <w:r>
+        <w:rPr>
+          <w:lang w:val="el-GR"/>
+        </w:rPr>
+        <w:t xml:space="preserve">" </w:t>
+      </w:r>
+      <w:r>
+        <w:rPr>
+          <w:lang w:val="de-DE"/>
+        </w:rPr>
+        <w:t>data</w:t>
+      </w:r>
+      <w:r>
+        <w:rPr>
+          <w:lang w:val="el-GR"/>
+        </w:rPr>
+        <w:t>-</w:t>
+      </w:r>
+      <w:r>
+        <w:rPr>
+          <w:lang w:val="de-DE"/>
+        </w:rPr>
+        <w:t>instgrm</w:t>
+      </w:r>
+      <w:r>
+        <w:rPr>
+          <w:lang w:val="el-GR"/>
+        </w:rPr>
+        <w:t>-</w:t>
+      </w:r>
+      <w:r>
+        <w:rPr>
+          <w:lang w:val="de-DE"/>
+        </w:rPr>
+        <w:t>version</w:t>
+      </w:r>
+      <w:r>
+        <w:rPr>
+          <w:lang w:val="el-GR"/>
+        </w:rPr>
+        <w:t xml:space="preserve">="14" </w:t>
+      </w:r>
+      <w:r>
+        <w:rPr>
+          <w:lang w:val="de-DE"/>
+        </w:rPr>
+        <w:t>style</w:t>
+      </w:r>
+      <w:r>
+        <w:rPr>
+          <w:lang w:val="el-GR"/>
+        </w:rPr>
+        <w:t xml:space="preserve">=" </w:t>
+      </w:r>
+      <w:r>
+        <w:rPr>
+          <w:lang w:val="de-DE"/>
+        </w:rPr>
+        <w:t>background</w:t>
+      </w:r>
+      <w:r>
+        <w:rPr>
+          <w:lang w:val="el-GR"/>
+        </w:rPr>
+        <w:t>:#</w:t>
+      </w:r>
+      <w:r>
+        <w:rPr>
+          <w:lang w:val="de-DE"/>
+        </w:rPr>
+        <w:t>FFF</w:t>
+      </w:r>
+      <w:r>
+        <w:rPr>
+          <w:lang w:val="el-GR"/>
+        </w:rPr>
+        <w:t xml:space="preserve">; </w:t>
+      </w:r>
+      <w:r>
+        <w:rPr>
+          <w:lang w:val="de-DE"/>
+        </w:rPr>
+        <w:t>border</w:t>
+      </w:r>
+      <w:r>
+        <w:rPr>
+          <w:lang w:val="el-GR"/>
+        </w:rPr>
+        <w:t xml:space="preserve">:0; </w:t>
+      </w:r>
+      <w:r>
+        <w:rPr>
+          <w:lang w:val="de-DE"/>
+        </w:rPr>
+        <w:t>border</w:t>
+      </w:r>
+      <w:r>
+        <w:rPr>
+          <w:lang w:val="el-GR"/>
+        </w:rPr>
+        <w:t>-</w:t>
+      </w:r>
+      <w:r>
+        <w:rPr>
+          <w:lang w:val="de-DE"/>
+        </w:rPr>
+        <w:t>radius</w:t>
+      </w:r>
+      <w:r>
+        <w:rPr>
+          <w:lang w:val="el-GR"/>
+        </w:rPr>
+        <w:t>:3</w:t>
+      </w:r>
+      <w:r>
+        <w:rPr>
+          <w:lang w:val="de-DE"/>
+        </w:rPr>
+        <w:t>px</w:t>
+      </w:r>
+      <w:r>
+        <w:rPr>
+          <w:lang w:val="el-GR"/>
+        </w:rPr>
+        <w:t xml:space="preserve">; </w:t>
+      </w:r>
+      <w:r>
+        <w:rPr>
+          <w:lang w:val="de-DE"/>
+        </w:rPr>
+        <w:t>box</w:t>
+      </w:r>
+      <w:r>
+        <w:rPr>
+          <w:lang w:val="el-GR"/>
+        </w:rPr>
+        <w:t>-</w:t>
+      </w:r>
+      <w:r>
+        <w:rPr>
+          <w:lang w:val="de-DE"/>
+        </w:rPr>
+        <w:t>shadow</w:t>
+      </w:r>
+      <w:r>
+        <w:rPr>
+          <w:lang w:val="el-GR"/>
+        </w:rPr>
+        <w:t>:0 0 1</w:t>
+      </w:r>
+      <w:r>
+        <w:rPr>
+          <w:lang w:val="de-DE"/>
+        </w:rPr>
+        <w:t>px</w:t>
+      </w:r>
+      <w:r>
+        <w:rPr>
+          <w:lang w:val="el-GR"/>
+        </w:rPr>
+        <w:t xml:space="preserve"> 0 </w:t>
+      </w:r>
+      <w:r>
+        <w:rPr>
+          <w:lang w:val="de-DE"/>
+        </w:rPr>
+        <w:t>rgba</w:t>
+      </w:r>
+      <w:r>
+        <w:rPr>
+          <w:lang w:val="el-GR"/>
+        </w:rPr>
+        <w:t>(0,0,0,0.5),0 1</w:t>
+      </w:r>
+      <w:r>
+        <w:rPr>
+          <w:lang w:val="de-DE"/>
+        </w:rPr>
+        <w:t>px</w:t>
+      </w:r>
+      <w:r>
+        <w:rPr>
+          <w:lang w:val="el-GR"/>
+        </w:rPr>
+        <w:t xml:space="preserve"> 10</w:t>
+      </w:r>
+      <w:r>
+        <w:rPr>
+          <w:lang w:val="de-DE"/>
+        </w:rPr>
+        <w:t>px</w:t>
+      </w:r>
+      <w:r>
+        <w:rPr>
+          <w:lang w:val="el-GR"/>
+        </w:rPr>
+        <w:t xml:space="preserve"> 0 </w:t>
+      </w:r>
+      <w:r>
+        <w:rPr>
+          <w:lang w:val="de-DE"/>
+        </w:rPr>
+        <w:t>rgba</w:t>
+      </w:r>
+      <w:r>
+        <w:rPr>
+          <w:lang w:val="el-GR"/>
+        </w:rPr>
+        <w:t xml:space="preserve">(0,0,0,0.15); </w:t>
+      </w:r>
+      <w:r>
+        <w:rPr>
+          <w:lang w:val="de-DE"/>
+        </w:rPr>
+        <w:t>margin</w:t>
+      </w:r>
+      <w:r>
+        <w:rPr>
+          <w:lang w:val="el-GR"/>
+        </w:rPr>
+        <w:t>: 1</w:t>
+      </w:r>
+      <w:r>
+        <w:rPr>
+          <w:lang w:val="de-DE"/>
+        </w:rPr>
+        <w:t>px</w:t>
+      </w:r>
+      <w:r>
+        <w:rPr>
+          <w:lang w:val="el-GR"/>
+        </w:rPr>
+        <w:t xml:space="preserve">; </w:t>
+      </w:r>
+      <w:r>
+        <w:rPr>
+          <w:lang w:val="de-DE"/>
+        </w:rPr>
+        <w:t>max</w:t>
+      </w:r>
+      <w:r>
+        <w:rPr>
+          <w:lang w:val="el-GR"/>
+        </w:rPr>
+        <w:t>-</w:t>
+      </w:r>
+      <w:r>
+        <w:rPr>
+          <w:lang w:val="de-DE"/>
+        </w:rPr>
+        <w:t>width</w:t>
+      </w:r>
+      <w:r>
+        <w:rPr>
+          <w:lang w:val="el-GR"/>
+        </w:rPr>
+        <w:t>:540</w:t>
+      </w:r>
+      <w:r>
+        <w:rPr>
+          <w:lang w:val="de-DE"/>
+        </w:rPr>
+        <w:t>px</w:t>
+      </w:r>
+      <w:r>
+        <w:rPr>
+          <w:lang w:val="el-GR"/>
+        </w:rPr>
+        <w:t xml:space="preserve">; </w:t>
+      </w:r>
+      <w:r>
+        <w:rPr>
+          <w:lang w:val="de-DE"/>
+        </w:rPr>
+        <w:t>min</w:t>
+      </w:r>
+      <w:r>
+        <w:rPr>
+          <w:lang w:val="el-GR"/>
+        </w:rPr>
+        <w:t>-</w:t>
+      </w:r>
+      <w:r>
+        <w:rPr>
+          <w:lang w:val="de-DE"/>
+        </w:rPr>
+        <w:t>width</w:t>
+      </w:r>
+      <w:r>
+        <w:rPr>
+          <w:lang w:val="el-GR"/>
+        </w:rPr>
+        <w:t>:326</w:t>
+      </w:r>
+      <w:r>
+        <w:rPr>
+          <w:lang w:val="de-DE"/>
+        </w:rPr>
+        <w:t>px</w:t>
+      </w:r>
+      <w:r>
+        <w:rPr>
+          <w:lang w:val="el-GR"/>
+        </w:rPr>
+        <w:t xml:space="preserve">; </w:t>
+      </w:r>
+      <w:r>
+        <w:rPr>
+          <w:lang w:val="de-DE"/>
+        </w:rPr>
+        <w:t>padding</w:t>
+      </w:r>
+      <w:r>
+        <w:rPr>
+          <w:lang w:val="el-GR"/>
+        </w:rPr>
+        <w:t xml:space="preserve">:0; </w:t>
+      </w:r>
+      <w:r>
+        <w:rPr>
+          <w:lang w:val="de-DE"/>
+        </w:rPr>
+        <w:t>width</w:t>
+      </w:r>
+      <w:r>
+        <w:rPr>
+          <w:lang w:val="el-GR"/>
+        </w:rPr>
+        <w:t xml:space="preserve">:99.375%; </w:t>
+      </w:r>
+      <w:r>
+        <w:rPr>
+          <w:lang w:val="de-DE"/>
+        </w:rPr>
+        <w:t>width</w:t>
+      </w:r>
+      <w:r>
+        <w:rPr>
+          <w:lang w:val="el-GR"/>
+        </w:rPr>
+        <w:t>:-</w:t>
+      </w:r>
+      <w:r>
+        <w:rPr>
+          <w:lang w:val="de-DE"/>
+        </w:rPr>
+        <w:t>webkit</w:t>
+      </w:r>
+      <w:r>
+        <w:rPr>
+          <w:lang w:val="el-GR"/>
+        </w:rPr>
+        <w:t>-</w:t>
+      </w:r>
+      <w:r>
+        <w:rPr>
+          <w:lang w:val="de-DE"/>
+        </w:rPr>
+        <w:t>calc</w:t>
+      </w:r>
+      <w:r>
+        <w:rPr>
+          <w:lang w:val="el-GR"/>
+        </w:rPr>
+        <w:t>(100% - 2</w:t>
+      </w:r>
+      <w:r>
+        <w:rPr>
+          <w:lang w:val="de-DE"/>
+        </w:rPr>
+        <w:t>px</w:t>
+      </w:r>
+      <w:r>
+        <w:rPr>
+          <w:lang w:val="el-GR"/>
+        </w:rPr>
+        <w:t xml:space="preserve">); </w:t>
+      </w:r>
+      <w:r>
+        <w:rPr>
+          <w:lang w:val="de-DE"/>
+        </w:rPr>
+        <w:t>width</w:t>
+      </w:r>
+      <w:r>
+        <w:rPr>
+          <w:lang w:val="el-GR"/>
+        </w:rPr>
+        <w:t>:</w:t>
+      </w:r>
+      <w:r>
+        <w:rPr>
+          <w:lang w:val="de-DE"/>
+        </w:rPr>
+        <w:t>calc</w:t>
+      </w:r>
+      <w:r>
+        <w:rPr>
+          <w:lang w:val="el-GR"/>
+        </w:rPr>
+        <w:t>(100% - 2</w:t>
+      </w:r>
+      <w:r>
+        <w:rPr>
+          <w:lang w:val="de-DE"/>
+        </w:rPr>
+        <w:t>px</w:t>
+      </w:r>
+      <w:r>
+        <w:rPr>
+          <w:lang w:val="el-GR"/>
+        </w:rPr>
+        <w:t>);"&gt;&lt;</w:t>
+      </w:r>
+      <w:r>
+        <w:rPr>
+          <w:lang w:val="de-DE"/>
+        </w:rPr>
+        <w:t>div</w:t>
+      </w:r>
+      <w:r>
+        <w:rPr>
+          <w:lang w:val="el-GR"/>
+        </w:rPr>
+        <w:t xml:space="preserve"> </w:t>
+      </w:r>
+      <w:r>
+        <w:rPr>
+          <w:lang w:val="de-DE"/>
+        </w:rPr>
+        <w:t>style</w:t>
+      </w:r>
+      <w:r>
+        <w:rPr>
+          <w:lang w:val="el-GR"/>
+        </w:rPr>
+        <w:t>="</w:t>
+      </w:r>
+      <w:r>
+        <w:rPr>
+          <w:lang w:val="de-DE"/>
+        </w:rPr>
+        <w:t>padding</w:t>
+      </w:r>
+      <w:r>
+        <w:rPr>
+          <w:lang w:val="el-GR"/>
+        </w:rPr>
+        <w:t>:16</w:t>
+      </w:r>
+      <w:r>
+        <w:rPr>
+          <w:lang w:val="de-DE"/>
+        </w:rPr>
+        <w:t>px</w:t>
+      </w:r>
+      <w:r>
+        <w:rPr>
+          <w:lang w:val="el-GR"/>
+        </w:rPr>
+        <w:t>;"&gt; &lt;</w:t>
+      </w:r>
+      <w:r>
+        <w:rPr>
+          <w:lang w:val="de-DE"/>
+        </w:rPr>
+        <w:t>a</w:t>
+      </w:r>
+      <w:r>
+        <w:rPr>
+          <w:lang w:val="el-GR"/>
+        </w:rPr>
+        <w:t xml:space="preserve"> </w:t>
+      </w:r>
+      <w:r>
+        <w:rPr>
+          <w:lang w:val="de-DE"/>
+        </w:rPr>
+        <w:t>href</w:t>
+      </w:r>
+      <w:r>
+        <w:rPr>
+          <w:lang w:val="el-GR"/>
+        </w:rPr>
+        <w:t>="</w:t>
+      </w:r>
+      <w:r>
+        <w:rPr>
+          <w:lang w:val="de-DE"/>
+        </w:rPr>
+        <w:t>https</w:t>
+      </w:r>
+      <w:r>
+        <w:rPr>
+          <w:lang w:val="el-GR"/>
+        </w:rPr>
+        <w:t>://</w:t>
+      </w:r>
+      <w:r>
+        <w:rPr>
+          <w:lang w:val="de-DE"/>
+        </w:rPr>
+        <w:t>www</w:t>
+      </w:r>
+      <w:r>
+        <w:rPr>
+          <w:lang w:val="el-GR"/>
+        </w:rPr>
+        <w:t>.</w:t>
+      </w:r>
+      <w:r>
+        <w:rPr>
+          <w:lang w:val="de-DE"/>
+        </w:rPr>
+        <w:t>instagram</w:t>
+      </w:r>
+      <w:r>
+        <w:rPr>
+          <w:lang w:val="el-GR"/>
+        </w:rPr>
+        <w:t>.</w:t>
+      </w:r>
+      <w:r>
+        <w:rPr>
+          <w:lang w:val="de-DE"/>
+        </w:rPr>
+        <w:t>com</w:t>
+      </w:r>
+      <w:r>
+        <w:rPr>
+          <w:lang w:val="el-GR"/>
+        </w:rPr>
+        <w:t>/</w:t>
+      </w:r>
+      <w:r>
+        <w:rPr>
+          <w:lang w:val="de-DE"/>
+        </w:rPr>
+        <w:t>p</w:t>
+      </w:r>
+      <w:r>
+        <w:rPr>
+          <w:lang w:val="el-GR"/>
+        </w:rPr>
+        <w:t>/</w:t>
+      </w:r>
+      <w:r>
+        <w:rPr>
+          <w:lang w:val="de-DE"/>
+        </w:rPr>
+        <w:t>DWZGhTPmKf</w:t>
+      </w:r>
+      <w:r>
+        <w:rPr>
+          <w:lang w:val="el-GR"/>
+        </w:rPr>
+        <w:t>_/?</w:t>
+      </w:r>
+      <w:r>
+        <w:rPr>
+          <w:lang w:val="de-DE"/>
+        </w:rPr>
+        <w:t>utm</w:t>
+      </w:r>
+      <w:r>
+        <w:rPr>
+          <w:lang w:val="el-GR"/>
+        </w:rPr>
+        <w:t>_</w:t>
+      </w:r>
+      <w:r>
+        <w:rPr>
+          <w:lang w:val="de-DE"/>
+        </w:rPr>
+        <w:t>source</w:t>
+      </w:r>
+      <w:r>
+        <w:rPr>
+          <w:lang w:val="el-GR"/>
+        </w:rPr>
+        <w:t>=</w:t>
+      </w:r>
+      <w:r>
+        <w:rPr>
+          <w:lang w:val="de-DE"/>
+        </w:rPr>
+        <w:t>ig</w:t>
+      </w:r>
+      <w:r>
+        <w:rPr>
+          <w:lang w:val="el-GR"/>
+        </w:rPr>
+        <w:t>_</w:t>
+      </w:r>
+      <w:r>
+        <w:rPr>
+          <w:lang w:val="de-DE"/>
+        </w:rPr>
+        <w:t>embed</w:t>
+      </w:r>
+      <w:r>
+        <w:rPr>
+          <w:lang w:val="el-GR"/>
+        </w:rPr>
+        <w:t>&amp;</w:t>
+      </w:r>
+      <w:r>
+        <w:rPr>
+          <w:lang w:val="de-DE"/>
+        </w:rPr>
+        <w:t>amp</w:t>
+      </w:r>
+      <w:r>
+        <w:rPr>
+          <w:lang w:val="el-GR"/>
+        </w:rPr>
+        <w:t>;</w:t>
+      </w:r>
+      <w:r>
+        <w:rPr>
+          <w:lang w:val="de-DE"/>
+        </w:rPr>
+        <w:t>utm</w:t>
+      </w:r>
+      <w:r>
+        <w:rPr>
+          <w:lang w:val="el-GR"/>
+        </w:rPr>
+        <w:t>_</w:t>
+      </w:r>
+      <w:r>
+        <w:rPr>
+          <w:lang w:val="de-DE"/>
+        </w:rPr>
+        <w:t>campaign</w:t>
+      </w:r>
+      <w:r>
+        <w:rPr>
+          <w:lang w:val="el-GR"/>
+        </w:rPr>
+        <w:t>=</w:t>
+      </w:r>
+      <w:r>
+        <w:rPr>
+          <w:lang w:val="de-DE"/>
+        </w:rPr>
+        <w:t>loading</w:t>
+      </w:r>
+      <w:r>
+        <w:rPr>
+          <w:lang w:val="el-GR"/>
+        </w:rPr>
+        <w:t xml:space="preserve">" </w:t>
+      </w:r>
+      <w:r>
+        <w:rPr>
+          <w:lang w:val="de-DE"/>
+        </w:rPr>
+        <w:t>style</w:t>
+      </w:r>
+      <w:r>
+        <w:rPr>
+          <w:lang w:val="el-GR"/>
+        </w:rPr>
+        <w:t xml:space="preserve">=" </w:t>
+      </w:r>
+      <w:r>
+        <w:rPr>
+          <w:lang w:val="de-DE"/>
+        </w:rPr>
+        <w:t>background</w:t>
+      </w:r>
+      <w:r>
+        <w:rPr>
+          <w:lang w:val="el-GR"/>
+        </w:rPr>
+        <w:t>:#</w:t>
+      </w:r>
+      <w:r>
+        <w:rPr>
+          <w:lang w:val="de-DE"/>
+        </w:rPr>
+        <w:t>FFFFFF</w:t>
+      </w:r>
+      <w:r>
+        <w:rPr>
+          <w:lang w:val="el-GR"/>
+        </w:rPr>
+        <w:t xml:space="preserve">; </w:t>
+      </w:r>
+      <w:r>
+        <w:rPr>
+          <w:lang w:val="de-DE"/>
+        </w:rPr>
+        <w:t>line</w:t>
+      </w:r>
+      <w:r>
+        <w:rPr>
+          <w:lang w:val="el-GR"/>
+        </w:rPr>
+        <w:t>-</w:t>
+      </w:r>
+      <w:r>
+        <w:rPr>
+          <w:lang w:val="de-DE"/>
+        </w:rPr>
+        <w:t>height</w:t>
+      </w:r>
+      <w:r>
+        <w:rPr>
+          <w:lang w:val="el-GR"/>
+        </w:rPr>
+        <w:t xml:space="preserve">:0; </w:t>
+      </w:r>
+      <w:r>
+        <w:rPr>
+          <w:lang w:val="de-DE"/>
+        </w:rPr>
+        <w:t>padding</w:t>
+      </w:r>
+      <w:r>
+        <w:rPr>
+          <w:lang w:val="el-GR"/>
+        </w:rPr>
+        <w:t xml:space="preserve">:0 0; </w:t>
+      </w:r>
+      <w:r>
+        <w:rPr>
+          <w:lang w:val="de-DE"/>
+        </w:rPr>
+        <w:t>text</w:t>
+      </w:r>
+      <w:r>
+        <w:rPr>
+          <w:lang w:val="el-GR"/>
+        </w:rPr>
+        <w:t>-</w:t>
+      </w:r>
+      <w:r>
+        <w:rPr>
+          <w:lang w:val="de-DE"/>
+        </w:rPr>
+        <w:t>align</w:t>
+      </w:r>
+      <w:r>
+        <w:rPr>
+          <w:lang w:val="el-GR"/>
+        </w:rPr>
+        <w:t>:</w:t>
+      </w:r>
+      <w:r>
+        <w:rPr>
+          <w:lang w:val="de-DE"/>
+        </w:rPr>
+        <w:t>center</w:t>
+      </w:r>
+      <w:r>
+        <w:rPr>
+          <w:lang w:val="el-GR"/>
+        </w:rPr>
+        <w:t xml:space="preserve">; </w:t>
+      </w:r>
+      <w:r>
+        <w:rPr>
+          <w:lang w:val="de-DE"/>
+        </w:rPr>
+        <w:t>text</w:t>
+      </w:r>
+      <w:r>
+        <w:rPr>
+          <w:lang w:val="el-GR"/>
+        </w:rPr>
+        <w:t>-</w:t>
+      </w:r>
+      <w:r>
+        <w:rPr>
+          <w:lang w:val="de-DE"/>
+        </w:rPr>
+        <w:t>decoration</w:t>
+      </w:r>
+      <w:r>
+        <w:rPr>
+          <w:lang w:val="el-GR"/>
+        </w:rPr>
+        <w:t>:</w:t>
+      </w:r>
+      <w:r>
+        <w:rPr>
+          <w:lang w:val="de-DE"/>
+        </w:rPr>
+        <w:t>none</w:t>
+      </w:r>
+      <w:r>
+        <w:rPr>
+          <w:lang w:val="el-GR"/>
+        </w:rPr>
+        <w:t xml:space="preserve">; </w:t>
+      </w:r>
+      <w:r>
+        <w:rPr>
+          <w:lang w:val="de-DE"/>
+        </w:rPr>
+        <w:t>width</w:t>
+      </w:r>
+      <w:r>
+        <w:rPr>
+          <w:lang w:val="el-GR"/>
+        </w:rPr>
+        <w:t xml:space="preserve">:100%;" </w:t>
+      </w:r>
+      <w:r>
+        <w:rPr>
+          <w:lang w:val="de-DE"/>
+        </w:rPr>
+        <w:t>target</w:t>
+      </w:r>
+      <w:r>
+        <w:rPr>
+          <w:lang w:val="el-GR"/>
+        </w:rPr>
+        <w:t>="_</w:t>
+      </w:r>
+      <w:r>
+        <w:rPr>
+          <w:lang w:val="de-DE"/>
+        </w:rPr>
+        <w:t>blank</w:t>
+      </w:r>
+      <w:r>
+        <w:rPr>
+          <w:lang w:val="el-GR"/>
+        </w:rPr>
+        <w:t>"&gt; &lt;</w:t>
+      </w:r>
+      <w:r>
+        <w:rPr>
+          <w:lang w:val="de-DE"/>
+        </w:rPr>
+        <w:t>div</w:t>
+      </w:r>
+      <w:r>
+        <w:rPr>
+          <w:lang w:val="el-GR"/>
+        </w:rPr>
+        <w:t xml:space="preserve"> </w:t>
+      </w:r>
+      <w:r>
+        <w:rPr>
+          <w:lang w:val="de-DE"/>
+        </w:rPr>
+        <w:t>style</w:t>
+      </w:r>
+      <w:r>
+        <w:rPr>
+          <w:lang w:val="el-GR"/>
+        </w:rPr>
+        <w:t xml:space="preserve">=" </w:t>
+      </w:r>
+      <w:r>
+        <w:rPr>
+          <w:lang w:val="de-DE"/>
+        </w:rPr>
+        <w:t>display</w:t>
+      </w:r>
+      <w:r>
+        <w:rPr>
+          <w:lang w:val="el-GR"/>
+        </w:rPr>
+        <w:t xml:space="preserve">: </w:t>
+      </w:r>
+      <w:r>
+        <w:rPr>
+          <w:lang w:val="de-DE"/>
+        </w:rPr>
+        <w:t>flex</w:t>
+      </w:r>
+      <w:r>
+        <w:rPr>
+          <w:lang w:val="el-GR"/>
+        </w:rPr>
+        <w:t xml:space="preserve">; </w:t>
+      </w:r>
+      <w:r>
+        <w:rPr>
+          <w:lang w:val="de-DE"/>
+        </w:rPr>
+        <w:t>flex</w:t>
+      </w:r>
+      <w:r>
+        <w:rPr>
+          <w:lang w:val="el-GR"/>
+        </w:rPr>
+        <w:t>-</w:t>
+      </w:r>
+      <w:r>
+        <w:rPr>
+          <w:lang w:val="de-DE"/>
+        </w:rPr>
+        <w:t>direction</w:t>
+      </w:r>
+      <w:r>
+        <w:rPr>
+          <w:lang w:val="el-GR"/>
+        </w:rPr>
+        <w:t xml:space="preserve">: </w:t>
+      </w:r>
+      <w:r>
+        <w:rPr>
+          <w:lang w:val="de-DE"/>
+        </w:rPr>
+        <w:t>row</w:t>
+      </w:r>
+      <w:r>
+        <w:rPr>
+          <w:lang w:val="el-GR"/>
+        </w:rPr>
+        <w:t xml:space="preserve">; </w:t>
+      </w:r>
+      <w:r>
+        <w:rPr>
+          <w:lang w:val="de-DE"/>
+        </w:rPr>
+        <w:t>align</w:t>
+      </w:r>
+      <w:r>
+        <w:rPr>
+          <w:lang w:val="el-GR"/>
+        </w:rPr>
+        <w:t>-</w:t>
+      </w:r>
+      <w:r>
+        <w:rPr>
+          <w:lang w:val="de-DE"/>
+        </w:rPr>
+        <w:t>items</w:t>
+      </w:r>
+      <w:r>
+        <w:rPr>
+          <w:lang w:val="el-GR"/>
+        </w:rPr>
+        <w:t xml:space="preserve">: </w:t>
+      </w:r>
+      <w:r>
+        <w:rPr>
+          <w:lang w:val="de-DE"/>
+        </w:rPr>
+        <w:t>center</w:t>
+      </w:r>
+      <w:r>
+        <w:rPr>
+          <w:lang w:val="el-GR"/>
+        </w:rPr>
+        <w:t>;"&gt; &lt;</w:t>
+      </w:r>
+      <w:r>
+        <w:rPr>
+          <w:lang w:val="de-DE"/>
+        </w:rPr>
+        <w:t>div</w:t>
+      </w:r>
+      <w:r>
+        <w:rPr>
+          <w:lang w:val="el-GR"/>
+        </w:rPr>
+        <w:t xml:space="preserve"> </w:t>
+      </w:r>
+      <w:r>
+        <w:rPr>
+          <w:lang w:val="de-DE"/>
+        </w:rPr>
+        <w:t>style</w:t>
+      </w:r>
+      <w:r>
+        <w:rPr>
+          <w:lang w:val="el-GR"/>
+        </w:rPr>
+        <w:t>="</w:t>
+      </w:r>
+      <w:r>
+        <w:rPr>
+          <w:lang w:val="de-DE"/>
+        </w:rPr>
+        <w:t>background</w:t>
+      </w:r>
+      <w:r>
+        <w:rPr>
+          <w:lang w:val="el-GR"/>
+        </w:rPr>
+        <w:t>-</w:t>
+      </w:r>
+      <w:r>
+        <w:rPr>
+          <w:lang w:val="de-DE"/>
+        </w:rPr>
+        <w:t>color</w:t>
+      </w:r>
+      <w:r>
+        <w:rPr>
+          <w:lang w:val="el-GR"/>
+        </w:rPr>
+        <w:t>: #</w:t>
+      </w:r>
+      <w:r>
+        <w:rPr>
+          <w:lang w:val="de-DE"/>
+        </w:rPr>
+        <w:t>F</w:t>
+      </w:r>
+      <w:r>
+        <w:rPr>
+          <w:lang w:val="el-GR"/>
+        </w:rPr>
+        <w:t>4</w:t>
+      </w:r>
+      <w:r>
+        <w:rPr>
+          <w:lang w:val="de-DE"/>
+        </w:rPr>
+        <w:t>F</w:t>
+      </w:r>
+      <w:r>
+        <w:rPr>
+          <w:lang w:val="el-GR"/>
+        </w:rPr>
+        <w:t>4</w:t>
+      </w:r>
+      <w:r>
+        <w:rPr>
+          <w:lang w:val="de-DE"/>
+        </w:rPr>
+        <w:t>F</w:t>
+      </w:r>
+      <w:r>
+        <w:rPr>
+          <w:lang w:val="el-GR"/>
+        </w:rPr>
+        <w:t xml:space="preserve">4; </w:t>
+      </w:r>
+      <w:r>
+        <w:rPr>
+          <w:lang w:val="de-DE"/>
+        </w:rPr>
+        <w:t>border</w:t>
+      </w:r>
+      <w:r>
+        <w:rPr>
+          <w:lang w:val="el-GR"/>
+        </w:rPr>
+        <w:t>-</w:t>
+      </w:r>
+      <w:r>
+        <w:rPr>
+          <w:lang w:val="de-DE"/>
+        </w:rPr>
+        <w:t>radius</w:t>
+      </w:r>
+      <w:r>
+        <w:rPr>
+          <w:lang w:val="el-GR"/>
+        </w:rPr>
+        <w:t xml:space="preserve">: 50%; </w:t>
+      </w:r>
+      <w:r>
+        <w:rPr>
+          <w:lang w:val="de-DE"/>
+        </w:rPr>
+        <w:t>flex</w:t>
+      </w:r>
+      <w:r>
+        <w:rPr>
+          <w:lang w:val="el-GR"/>
+        </w:rPr>
+        <w:t>-</w:t>
+      </w:r>
+      <w:r>
+        <w:rPr>
+          <w:lang w:val="de-DE"/>
+        </w:rPr>
+        <w:t>grow</w:t>
+      </w:r>
+      <w:r>
+        <w:rPr>
+          <w:lang w:val="el-GR"/>
+        </w:rPr>
+        <w:t xml:space="preserve">: 0; </w:t>
+      </w:r>
+      <w:r>
+        <w:rPr>
+          <w:lang w:val="de-DE"/>
+        </w:rPr>
+        <w:t>height</w:t>
+      </w:r>
+      <w:r>
+        <w:rPr>
+          <w:lang w:val="el-GR"/>
+        </w:rPr>
+        <w:t>: 40</w:t>
+      </w:r>
+      <w:r>
+        <w:rPr>
+          <w:lang w:val="de-DE"/>
+        </w:rPr>
+        <w:t>px</w:t>
+      </w:r>
+      <w:r>
+        <w:rPr>
+          <w:lang w:val="el-GR"/>
+        </w:rPr>
+        <w:t xml:space="preserve">; </w:t>
+      </w:r>
+      <w:r>
+        <w:rPr>
+          <w:lang w:val="de-DE"/>
+        </w:rPr>
+        <w:t>margin</w:t>
+      </w:r>
+      <w:r>
+        <w:rPr>
+          <w:lang w:val="el-GR"/>
+        </w:rPr>
+        <w:t>-</w:t>
+      </w:r>
+      <w:r>
+        <w:rPr>
+          <w:lang w:val="de-DE"/>
+        </w:rPr>
+        <w:t>right</w:t>
+      </w:r>
+      <w:r>
+        <w:rPr>
+          <w:lang w:val="el-GR"/>
+        </w:rPr>
+        <w:t>: 14</w:t>
+      </w:r>
+      <w:r>
+        <w:rPr>
+          <w:lang w:val="de-DE"/>
+        </w:rPr>
+        <w:t>px</w:t>
+      </w:r>
+      <w:r>
+        <w:rPr>
+          <w:lang w:val="el-GR"/>
+        </w:rPr>
+        <w:t xml:space="preserve">; </w:t>
+      </w:r>
+      <w:r>
+        <w:rPr>
+          <w:lang w:val="de-DE"/>
+        </w:rPr>
+        <w:t>width</w:t>
+      </w:r>
+      <w:r>
+        <w:rPr>
+          <w:lang w:val="el-GR"/>
+        </w:rPr>
+        <w:t>: 40</w:t>
+      </w:r>
+      <w:r>
+        <w:rPr>
+          <w:lang w:val="de-DE"/>
+        </w:rPr>
+        <w:t>px</w:t>
+      </w:r>
+      <w:r>
+        <w:rPr>
+          <w:lang w:val="el-GR"/>
+        </w:rPr>
+        <w:t>;"&gt;&lt;/</w:t>
+      </w:r>
+      <w:r>
+        <w:rPr>
+          <w:lang w:val="de-DE"/>
+        </w:rPr>
+        <w:t>div</w:t>
+      </w:r>
+      <w:r>
+        <w:rPr>
+          <w:lang w:val="el-GR"/>
+        </w:rPr>
+        <w:t>&gt; &lt;</w:t>
+      </w:r>
+      <w:r>
+        <w:rPr>
+          <w:lang w:val="de-DE"/>
+        </w:rPr>
+        <w:t>div</w:t>
+      </w:r>
+      <w:r>
+        <w:rPr>
+          <w:lang w:val="el-GR"/>
+        </w:rPr>
+        <w:t xml:space="preserve"> </w:t>
+      </w:r>
+      <w:r>
+        <w:rPr>
+          <w:lang w:val="de-DE"/>
+        </w:rPr>
+        <w:t>style</w:t>
+      </w:r>
+      <w:r>
+        <w:rPr>
+          <w:lang w:val="el-GR"/>
+        </w:rPr>
+        <w:t>="</w:t>
+      </w:r>
+      <w:r>
+        <w:rPr>
+          <w:lang w:val="de-DE"/>
+        </w:rPr>
+        <w:t>display</w:t>
+      </w:r>
+      <w:r>
+        <w:rPr>
+          <w:lang w:val="el-GR"/>
+        </w:rPr>
+        <w:t xml:space="preserve">: </w:t>
+      </w:r>
+      <w:r>
+        <w:rPr>
+          <w:lang w:val="de-DE"/>
+        </w:rPr>
+        <w:t>flex</w:t>
+      </w:r>
+      <w:r>
+        <w:rPr>
+          <w:lang w:val="el-GR"/>
+        </w:rPr>
+        <w:t xml:space="preserve">; </w:t>
+      </w:r>
+      <w:r>
+        <w:rPr>
+          <w:lang w:val="de-DE"/>
+        </w:rPr>
+        <w:t>flex</w:t>
+      </w:r>
+      <w:r>
+        <w:rPr>
+          <w:lang w:val="el-GR"/>
+        </w:rPr>
+        <w:t>-</w:t>
+      </w:r>
+      <w:r>
+        <w:rPr>
+          <w:lang w:val="de-DE"/>
+        </w:rPr>
+        <w:t>direction</w:t>
+      </w:r>
+      <w:r>
+        <w:rPr>
+          <w:lang w:val="el-GR"/>
+        </w:rPr>
+        <w:t xml:space="preserve">: </w:t>
+      </w:r>
+      <w:r>
+        <w:rPr>
+          <w:lang w:val="de-DE"/>
+        </w:rPr>
+        <w:t>column</w:t>
+      </w:r>
+      <w:r>
+        <w:rPr>
+          <w:lang w:val="el-GR"/>
+        </w:rPr>
+        <w:t xml:space="preserve">; </w:t>
+      </w:r>
+      <w:r>
+        <w:rPr>
+          <w:lang w:val="de-DE"/>
+        </w:rPr>
+        <w:t>flex</w:t>
+      </w:r>
+      <w:r>
+        <w:rPr>
+          <w:lang w:val="el-GR"/>
+        </w:rPr>
+        <w:t>-</w:t>
+      </w:r>
+      <w:r>
+        <w:rPr>
+          <w:lang w:val="de-DE"/>
+        </w:rPr>
+        <w:t>grow</w:t>
+      </w:r>
+      <w:r>
+        <w:rPr>
+          <w:lang w:val="el-GR"/>
+        </w:rPr>
+        <w:t xml:space="preserve">: 1; </w:t>
+      </w:r>
+      <w:r>
+        <w:rPr>
+          <w:lang w:val="de-DE"/>
+        </w:rPr>
+        <w:t>justify</w:t>
+      </w:r>
+      <w:r>
+        <w:rPr>
+          <w:lang w:val="el-GR"/>
+        </w:rPr>
+        <w:t>-</w:t>
+      </w:r>
+      <w:r>
+        <w:rPr>
+          <w:lang w:val="de-DE"/>
+        </w:rPr>
+        <w:t>content</w:t>
+      </w:r>
+      <w:r>
+        <w:rPr>
+          <w:lang w:val="el-GR"/>
+        </w:rPr>
+        <w:t xml:space="preserve">: </w:t>
+      </w:r>
+      <w:r>
+        <w:rPr>
+          <w:lang w:val="de-DE"/>
+        </w:rPr>
+        <w:t>center</w:t>
+      </w:r>
+      <w:r>
+        <w:rPr>
+          <w:lang w:val="el-GR"/>
+        </w:rPr>
+        <w:t>;"&gt; &lt;</w:t>
+      </w:r>
+      <w:r>
+        <w:rPr>
+          <w:lang w:val="de-DE"/>
+        </w:rPr>
+        <w:t>div</w:t>
+      </w:r>
+      <w:r>
+        <w:rPr>
+          <w:lang w:val="el-GR"/>
+        </w:rPr>
+        <w:t xml:space="preserve"> </w:t>
+      </w:r>
+      <w:r>
+        <w:rPr>
+          <w:lang w:val="de-DE"/>
+        </w:rPr>
+        <w:t>style</w:t>
+      </w:r>
+      <w:r>
+        <w:rPr>
+          <w:lang w:val="el-GR"/>
+        </w:rPr>
+        <w:t xml:space="preserve">=" </w:t>
+      </w:r>
+      <w:r>
+        <w:rPr>
+          <w:lang w:val="de-DE"/>
+        </w:rPr>
+        <w:t>background</w:t>
+      </w:r>
+      <w:r>
+        <w:rPr>
+          <w:lang w:val="el-GR"/>
+        </w:rPr>
+        <w:t>-</w:t>
+      </w:r>
+      <w:r>
+        <w:rPr>
+          <w:lang w:val="de-DE"/>
+        </w:rPr>
+        <w:t>color</w:t>
+      </w:r>
+      <w:r>
+        <w:rPr>
+          <w:lang w:val="el-GR"/>
+        </w:rPr>
+        <w:t>: #</w:t>
+      </w:r>
+      <w:r>
+        <w:rPr>
+          <w:lang w:val="de-DE"/>
+        </w:rPr>
+        <w:t>F</w:t>
+      </w:r>
+      <w:r>
+        <w:rPr>
+          <w:lang w:val="el-GR"/>
+        </w:rPr>
+        <w:t>4</w:t>
+      </w:r>
+      <w:r>
+        <w:rPr>
+          <w:lang w:val="de-DE"/>
+        </w:rPr>
+        <w:t>F</w:t>
+      </w:r>
+      <w:r>
+        <w:rPr>
+          <w:lang w:val="el-GR"/>
+        </w:rPr>
+        <w:t>4</w:t>
+      </w:r>
+      <w:r>
+        <w:rPr>
+          <w:lang w:val="de-DE"/>
+        </w:rPr>
+        <w:t>F</w:t>
+      </w:r>
+      <w:r>
+        <w:rPr>
+          <w:lang w:val="el-GR"/>
+        </w:rPr>
+        <w:t xml:space="preserve">4; </w:t>
+      </w:r>
+      <w:r>
+        <w:rPr>
+          <w:lang w:val="de-DE"/>
+        </w:rPr>
+        <w:t>border</w:t>
+      </w:r>
+      <w:r>
+        <w:rPr>
+          <w:lang w:val="el-GR"/>
+        </w:rPr>
+        <w:t>-</w:t>
+      </w:r>
+      <w:r>
+        <w:rPr>
+          <w:lang w:val="de-DE"/>
+        </w:rPr>
+        <w:t>radius</w:t>
+      </w:r>
+      <w:r>
+        <w:rPr>
+          <w:lang w:val="el-GR"/>
+        </w:rPr>
+        <w:t>: 4</w:t>
+      </w:r>
+      <w:r>
+        <w:rPr>
+          <w:lang w:val="de-DE"/>
+        </w:rPr>
+        <w:t>px</w:t>
+      </w:r>
+      <w:r>
+        <w:rPr>
+          <w:lang w:val="el-GR"/>
+        </w:rPr>
+        <w:t xml:space="preserve">; </w:t>
+      </w:r>
+      <w:r>
+        <w:rPr>
+          <w:lang w:val="de-DE"/>
+        </w:rPr>
+        <w:t>flex</w:t>
+      </w:r>
+      <w:r>
+        <w:rPr>
+          <w:lang w:val="el-GR"/>
+        </w:rPr>
+        <w:t>-</w:t>
+      </w:r>
+      <w:r>
+        <w:rPr>
+          <w:lang w:val="de-DE"/>
+        </w:rPr>
+        <w:t>grow</w:t>
+      </w:r>
+      <w:r>
+        <w:rPr>
+          <w:lang w:val="el-GR"/>
+        </w:rPr>
+        <w:t xml:space="preserve">: 0; </w:t>
+      </w:r>
+      <w:r>
+        <w:rPr>
+          <w:lang w:val="de-DE"/>
+        </w:rPr>
+        <w:t>height</w:t>
+      </w:r>
+      <w:r>
+        <w:rPr>
+          <w:lang w:val="el-GR"/>
+        </w:rPr>
+        <w:t>: 14</w:t>
+      </w:r>
+      <w:r>
+        <w:rPr>
+          <w:lang w:val="de-DE"/>
+        </w:rPr>
+        <w:t>px</w:t>
+      </w:r>
+      <w:r>
+        <w:rPr>
+          <w:lang w:val="el-GR"/>
+        </w:rPr>
+        <w:t xml:space="preserve">; </w:t>
+      </w:r>
+      <w:r>
+        <w:rPr>
+          <w:lang w:val="de-DE"/>
+        </w:rPr>
+        <w:t>margin</w:t>
+      </w:r>
+      <w:r>
+        <w:rPr>
+          <w:lang w:val="el-GR"/>
+        </w:rPr>
+        <w:t>-</w:t>
+      </w:r>
+      <w:r>
+        <w:rPr>
+          <w:lang w:val="de-DE"/>
+        </w:rPr>
+        <w:t>bottom</w:t>
+      </w:r>
+      <w:r>
+        <w:rPr>
+          <w:lang w:val="el-GR"/>
+        </w:rPr>
+        <w:t>: 6</w:t>
+      </w:r>
+      <w:r>
+        <w:rPr>
+          <w:lang w:val="de-DE"/>
+        </w:rPr>
+        <w:t>px</w:t>
+      </w:r>
+      <w:r>
+        <w:rPr>
+          <w:lang w:val="el-GR"/>
+        </w:rPr>
+        <w:t xml:space="preserve">; </w:t>
+      </w:r>
+      <w:r>
+        <w:rPr>
+          <w:lang w:val="de-DE"/>
+        </w:rPr>
+        <w:t>width</w:t>
+      </w:r>
+      <w:r>
+        <w:rPr>
+          <w:lang w:val="el-GR"/>
+        </w:rPr>
+        <w:t>: 100</w:t>
+      </w:r>
+      <w:r>
+        <w:rPr>
+          <w:lang w:val="de-DE"/>
+        </w:rPr>
+        <w:t>px</w:t>
+      </w:r>
+      <w:r>
+        <w:rPr>
+          <w:lang w:val="el-GR"/>
+        </w:rPr>
+        <w:t>;"&gt;&lt;/</w:t>
+      </w:r>
+      <w:r>
+        <w:rPr>
+          <w:lang w:val="de-DE"/>
+        </w:rPr>
+        <w:t>div</w:t>
+      </w:r>
+      <w:r>
+        <w:rPr>
+          <w:lang w:val="el-GR"/>
+        </w:rPr>
+        <w:t>&gt; &lt;</w:t>
+      </w:r>
+      <w:r>
+        <w:rPr>
+          <w:lang w:val="de-DE"/>
+        </w:rPr>
+        <w:t>div</w:t>
+      </w:r>
+      <w:r>
+        <w:rPr>
+          <w:lang w:val="el-GR"/>
+        </w:rPr>
+        <w:t xml:space="preserve"> </w:t>
+      </w:r>
+      <w:r>
+        <w:rPr>
+          <w:lang w:val="de-DE"/>
+        </w:rPr>
+        <w:t>style</w:t>
+      </w:r>
+      <w:r>
+        <w:rPr>
+          <w:lang w:val="el-GR"/>
+        </w:rPr>
+        <w:t xml:space="preserve">=" </w:t>
+      </w:r>
+      <w:r>
+        <w:rPr>
+          <w:lang w:val="de-DE"/>
+        </w:rPr>
+        <w:t>background</w:t>
+      </w:r>
+      <w:r>
+        <w:rPr>
+          <w:lang w:val="el-GR"/>
+        </w:rPr>
+        <w:t>-</w:t>
+      </w:r>
+      <w:r>
+        <w:rPr>
+          <w:lang w:val="de-DE"/>
+        </w:rPr>
+        <w:t>color</w:t>
+      </w:r>
+      <w:r>
+        <w:rPr>
+          <w:lang w:val="el-GR"/>
+        </w:rPr>
+        <w:t>: #</w:t>
+      </w:r>
+      <w:r>
+        <w:rPr>
+          <w:lang w:val="de-DE"/>
+        </w:rPr>
+        <w:t>F</w:t>
+      </w:r>
+      <w:r>
+        <w:rPr>
+          <w:lang w:val="el-GR"/>
+        </w:rPr>
+        <w:t>4</w:t>
+      </w:r>
+      <w:r>
+        <w:rPr>
+          <w:lang w:val="de-DE"/>
+        </w:rPr>
+        <w:t>F</w:t>
+      </w:r>
+      <w:r>
+        <w:rPr>
+          <w:lang w:val="el-GR"/>
+        </w:rPr>
+        <w:t>4</w:t>
+      </w:r>
+      <w:r>
+        <w:rPr>
+          <w:lang w:val="de-DE"/>
+        </w:rPr>
+        <w:t>F</w:t>
+      </w:r>
+      <w:r>
+        <w:rPr>
+          <w:lang w:val="el-GR"/>
+        </w:rPr>
+        <w:t xml:space="preserve">4; </w:t>
+      </w:r>
+      <w:r>
+        <w:rPr>
+          <w:lang w:val="de-DE"/>
+        </w:rPr>
+        <w:t>border</w:t>
+      </w:r>
+      <w:r>
+        <w:rPr>
+          <w:lang w:val="el-GR"/>
+        </w:rPr>
+        <w:t>-</w:t>
+      </w:r>
+      <w:r>
+        <w:rPr>
+          <w:lang w:val="de-DE"/>
+        </w:rPr>
+        <w:t>radius</w:t>
+      </w:r>
+      <w:r>
+        <w:rPr>
+          <w:lang w:val="el-GR"/>
+        </w:rPr>
+        <w:t>: 4</w:t>
+      </w:r>
+      <w:r>
+        <w:rPr>
+          <w:lang w:val="de-DE"/>
+        </w:rPr>
+        <w:t>px</w:t>
+      </w:r>
+      <w:r>
+        <w:rPr>
+          <w:lang w:val="el-GR"/>
+        </w:rPr>
+        <w:t xml:space="preserve">; </w:t>
+      </w:r>
+      <w:r>
+        <w:rPr>
+          <w:lang w:val="de-DE"/>
+        </w:rPr>
+        <w:t>flex</w:t>
+      </w:r>
+      <w:r>
+        <w:rPr>
+          <w:lang w:val="el-GR"/>
+        </w:rPr>
+        <w:t>-</w:t>
+      </w:r>
+      <w:r>
+        <w:rPr>
+          <w:lang w:val="de-DE"/>
+        </w:rPr>
+        <w:t>grow</w:t>
+      </w:r>
+      <w:r>
+        <w:rPr>
+          <w:lang w:val="el-GR"/>
+        </w:rPr>
+        <w:t xml:space="preserve">: 0; </w:t>
+      </w:r>
+      <w:r>
+        <w:rPr>
+          <w:lang w:val="de-DE"/>
+        </w:rPr>
+        <w:t>height</w:t>
+      </w:r>
+      <w:r>
+        <w:rPr>
+          <w:lang w:val="el-GR"/>
+        </w:rPr>
+        <w:t>: 14</w:t>
+      </w:r>
+      <w:r>
+        <w:rPr>
+          <w:lang w:val="de-DE"/>
+        </w:rPr>
+        <w:t>px</w:t>
+      </w:r>
+      <w:r>
+        <w:rPr>
+          <w:lang w:val="el-GR"/>
+        </w:rPr>
+        <w:t xml:space="preserve">; </w:t>
+      </w:r>
+      <w:r>
+        <w:rPr>
+          <w:lang w:val="de-DE"/>
+        </w:rPr>
+        <w:t>width</w:t>
+      </w:r>
+      <w:r>
+        <w:rPr>
+          <w:lang w:val="el-GR"/>
+        </w:rPr>
+        <w:t>: 60</w:t>
+      </w:r>
+      <w:r>
+        <w:rPr>
+          <w:lang w:val="de-DE"/>
+        </w:rPr>
+        <w:t>px</w:t>
+      </w:r>
+      <w:r>
+        <w:rPr>
+          <w:lang w:val="el-GR"/>
+        </w:rPr>
+        <w:t>;"&gt;&lt;/</w:t>
+      </w:r>
+      <w:r>
+        <w:rPr>
+          <w:lang w:val="de-DE"/>
+        </w:rPr>
+        <w:t>div</w:t>
+      </w:r>
+      <w:r>
+        <w:rPr>
+          <w:lang w:val="el-GR"/>
+        </w:rPr>
+        <w:t>&gt;&lt;/</w:t>
+      </w:r>
+      <w:r>
+        <w:rPr>
+          <w:lang w:val="de-DE"/>
+        </w:rPr>
+        <w:t>div</w:t>
+      </w:r>
+      <w:r>
+        <w:rPr>
+          <w:lang w:val="el-GR"/>
+        </w:rPr>
+        <w:t>&gt;&lt;/</w:t>
+      </w:r>
+      <w:r>
+        <w:rPr>
+          <w:lang w:val="de-DE"/>
+        </w:rPr>
+        <w:t>div</w:t>
+      </w:r>
+      <w:r>
+        <w:rPr>
+          <w:lang w:val="el-GR"/>
+        </w:rPr>
+        <w:t>&gt;&lt;</w:t>
+      </w:r>
+      <w:r>
+        <w:rPr>
+          <w:lang w:val="de-DE"/>
+        </w:rPr>
+        <w:t>div</w:t>
+      </w:r>
+      <w:r>
+        <w:rPr>
+          <w:lang w:val="el-GR"/>
+        </w:rPr>
+        <w:t xml:space="preserve"> </w:t>
+      </w:r>
+      <w:r>
+        <w:rPr>
+          <w:lang w:val="de-DE"/>
+        </w:rPr>
+        <w:t>style</w:t>
+      </w:r>
+      <w:r>
+        <w:rPr>
+          <w:lang w:val="el-GR"/>
+        </w:rPr>
+        <w:t>="</w:t>
+      </w:r>
+      <w:r>
+        <w:rPr>
+          <w:lang w:val="de-DE"/>
+        </w:rPr>
+        <w:t>padding</w:t>
+      </w:r>
+      <w:r>
+        <w:rPr>
+          <w:lang w:val="el-GR"/>
+        </w:rPr>
+        <w:t>: 19% 0;"&gt;&lt;/</w:t>
+      </w:r>
+      <w:r>
+        <w:rPr>
+          <w:lang w:val="de-DE"/>
+        </w:rPr>
+        <w:t>div</w:t>
+      </w:r>
+      <w:r>
+        <w:rPr>
+          <w:lang w:val="el-GR"/>
+        </w:rPr>
+        <w:t>&gt; &lt;</w:t>
+      </w:r>
+      <w:r>
+        <w:rPr>
+          <w:lang w:val="de-DE"/>
+        </w:rPr>
+        <w:t>div</w:t>
+      </w:r>
+      <w:r>
+        <w:rPr>
+          <w:lang w:val="el-GR"/>
+        </w:rPr>
+        <w:t xml:space="preserve"> </w:t>
+      </w:r>
+      <w:r>
+        <w:rPr>
+          <w:lang w:val="de-DE"/>
+        </w:rPr>
+        <w:t>style</w:t>
+      </w:r>
+      <w:r>
+        <w:rPr>
+          <w:lang w:val="el-GR"/>
+        </w:rPr>
+        <w:t>="</w:t>
+      </w:r>
+      <w:r>
+        <w:rPr>
+          <w:lang w:val="de-DE"/>
+        </w:rPr>
+        <w:t>display</w:t>
+      </w:r>
+      <w:r>
+        <w:rPr>
+          <w:lang w:val="el-GR"/>
+        </w:rPr>
+        <w:t>:</w:t>
+      </w:r>
+      <w:r>
+        <w:rPr>
+          <w:lang w:val="de-DE"/>
+        </w:rPr>
+        <w:t>block</w:t>
+      </w:r>
+      <w:r>
+        <w:rPr>
+          <w:lang w:val="el-GR"/>
+        </w:rPr>
+        <w:t xml:space="preserve">; </w:t>
+      </w:r>
+      <w:r>
+        <w:rPr>
+          <w:lang w:val="de-DE"/>
+        </w:rPr>
+        <w:t>height</w:t>
+      </w:r>
+      <w:r>
+        <w:rPr>
+          <w:lang w:val="el-GR"/>
+        </w:rPr>
+        <w:t>:50</w:t>
+      </w:r>
+      <w:r>
+        <w:rPr>
+          <w:lang w:val="de-DE"/>
+        </w:rPr>
+        <w:t>px</w:t>
+      </w:r>
+      <w:r>
+        <w:rPr>
+          <w:lang w:val="el-GR"/>
+        </w:rPr>
+        <w:t xml:space="preserve">; </w:t>
+      </w:r>
+      <w:r>
+        <w:rPr>
+          <w:lang w:val="de-DE"/>
+        </w:rPr>
+        <w:t>margin</w:t>
+      </w:r>
+      <w:r>
+        <w:rPr>
+          <w:lang w:val="el-GR"/>
+        </w:rPr>
+        <w:t xml:space="preserve">:0 </w:t>
+      </w:r>
+      <w:r>
+        <w:rPr>
+          <w:lang w:val="de-DE"/>
+        </w:rPr>
+        <w:t>auto</w:t>
+      </w:r>
+      <w:r>
+        <w:rPr>
+          <w:lang w:val="el-GR"/>
+        </w:rPr>
+        <w:t xml:space="preserve"> 12</w:t>
+      </w:r>
+      <w:r>
+        <w:rPr>
+          <w:lang w:val="de-DE"/>
+        </w:rPr>
+        <w:t>px</w:t>
+      </w:r>
+      <w:r>
+        <w:rPr>
+          <w:lang w:val="el-GR"/>
+        </w:rPr>
+        <w:t xml:space="preserve">; </w:t>
+      </w:r>
+      <w:r>
+        <w:rPr>
+          <w:lang w:val="de-DE"/>
+        </w:rPr>
+        <w:t>width</w:t>
+      </w:r>
+      <w:r>
+        <w:rPr>
+          <w:lang w:val="el-GR"/>
+        </w:rPr>
+        <w:t>:50</w:t>
+      </w:r>
+      <w:r>
+        <w:rPr>
+          <w:lang w:val="de-DE"/>
+        </w:rPr>
+        <w:t>px</w:t>
+      </w:r>
+      <w:r>
+        <w:rPr>
+          <w:lang w:val="el-GR"/>
+        </w:rPr>
+        <w:t>;"&gt;&lt;</w:t>
+      </w:r>
+      <w:r>
+        <w:rPr>
+          <w:lang w:val="de-DE"/>
+        </w:rPr>
+        <w:t>svg</w:t>
+      </w:r>
+      <w:r>
+        <w:rPr>
+          <w:lang w:val="el-GR"/>
+        </w:rPr>
+        <w:t xml:space="preserve"> </w:t>
+      </w:r>
+      <w:r>
+        <w:rPr>
+          <w:lang w:val="de-DE"/>
+        </w:rPr>
+        <w:t>width</w:t>
+      </w:r>
+      <w:r>
+        <w:rPr>
+          <w:lang w:val="el-GR"/>
+        </w:rPr>
+        <w:t>="50</w:t>
+      </w:r>
+      <w:r>
+        <w:rPr>
+          <w:lang w:val="de-DE"/>
+        </w:rPr>
+        <w:t>px</w:t>
+      </w:r>
+      <w:r>
+        <w:rPr>
+          <w:lang w:val="el-GR"/>
+        </w:rPr>
+        <w:t xml:space="preserve">" </w:t>
+      </w:r>
+      <w:r>
+        <w:rPr>
+          <w:lang w:val="de-DE"/>
+        </w:rPr>
+        <w:t>height</w:t>
+      </w:r>
+      <w:r>
+        <w:rPr>
+          <w:lang w:val="el-GR"/>
+        </w:rPr>
+        <w:t>="50</w:t>
+      </w:r>
+      <w:r>
+        <w:rPr>
+          <w:lang w:val="de-DE"/>
+        </w:rPr>
+        <w:t>px</w:t>
+      </w:r>
+      <w:r>
+        <w:rPr>
+          <w:lang w:val="el-GR"/>
+        </w:rPr>
+        <w:t xml:space="preserve">" </w:t>
+      </w:r>
+      <w:r>
+        <w:rPr>
+          <w:lang w:val="de-DE"/>
+        </w:rPr>
+        <w:t>viewBox</w:t>
+      </w:r>
+      <w:r>
+        <w:rPr>
+          <w:lang w:val="el-GR"/>
+        </w:rPr>
+        <w:t xml:space="preserve">="0 0 60 60" </w:t>
+      </w:r>
+      <w:r>
+        <w:rPr>
+          <w:lang w:val="de-DE"/>
+        </w:rPr>
+        <w:t>version</w:t>
+      </w:r>
+      <w:r>
+        <w:rPr>
+          <w:lang w:val="el-GR"/>
+        </w:rPr>
+        <w:t xml:space="preserve">="1.1" </w:t>
+      </w:r>
+      <w:r>
+        <w:rPr>
+          <w:lang w:val="de-DE"/>
+        </w:rPr>
+        <w:t>xmlns</w:t>
+      </w:r>
+      <w:r>
+        <w:rPr>
+          <w:lang w:val="el-GR"/>
+        </w:rPr>
+        <w:t>="</w:t>
+      </w:r>
+      <w:r>
+        <w:rPr>
+          <w:lang w:val="de-DE"/>
+        </w:rPr>
+        <w:t>https</w:t>
+      </w:r>
+      <w:r>
+        <w:rPr>
+          <w:lang w:val="el-GR"/>
+        </w:rPr>
+        <w:t>://</w:t>
+      </w:r>
+      <w:r>
+        <w:rPr>
+          <w:lang w:val="de-DE"/>
+        </w:rPr>
+        <w:t>www</w:t>
+      </w:r>
+      <w:r>
+        <w:rPr>
+          <w:lang w:val="el-GR"/>
+        </w:rPr>
+        <w:t>.</w:t>
+      </w:r>
+      <w:r>
+        <w:rPr>
+          <w:lang w:val="de-DE"/>
+        </w:rPr>
+        <w:t>w</w:t>
+      </w:r>
+      <w:r>
+        <w:rPr>
+          <w:lang w:val="el-GR"/>
+        </w:rPr>
+        <w:t>3.</w:t>
+      </w:r>
+      <w:r>
+        <w:rPr>
+          <w:lang w:val="de-DE"/>
+        </w:rPr>
+        <w:t>org</w:t>
+      </w:r>
+      <w:r>
+        <w:rPr>
+          <w:lang w:val="el-GR"/>
+        </w:rPr>
+        <w:t>/2000/</w:t>
+      </w:r>
+      <w:r>
+        <w:rPr>
+          <w:lang w:val="de-DE"/>
+        </w:rPr>
+        <w:t>svg</w:t>
+      </w:r>
+      <w:r>
+        <w:rPr>
+          <w:lang w:val="el-GR"/>
+        </w:rPr>
+        <w:t xml:space="preserve">" </w:t>
+      </w:r>
+      <w:r>
+        <w:rPr>
+          <w:lang w:val="de-DE"/>
+        </w:rPr>
+        <w:t>xmlns</w:t>
+      </w:r>
+      <w:r>
+        <w:rPr>
+          <w:lang w:val="el-GR"/>
+        </w:rPr>
+        <w:t>:</w:t>
+      </w:r>
+      <w:r>
+        <w:rPr>
+          <w:lang w:val="de-DE"/>
+        </w:rPr>
+        <w:t>xlink</w:t>
+      </w:r>
+      <w:r>
+        <w:rPr>
+          <w:lang w:val="el-GR"/>
+        </w:rPr>
+        <w:t>="</w:t>
+      </w:r>
+      <w:r>
+        <w:rPr>
+          <w:lang w:val="de-DE"/>
+        </w:rPr>
+        <w:t>https</w:t>
+      </w:r>
+      <w:r>
+        <w:rPr>
+          <w:lang w:val="el-GR"/>
+        </w:rPr>
+        <w:t>://</w:t>
+      </w:r>
+      <w:r>
+        <w:rPr>
+          <w:lang w:val="de-DE"/>
+        </w:rPr>
+        <w:t>www</w:t>
+      </w:r>
+      <w:r>
+        <w:rPr>
+          <w:lang w:val="el-GR"/>
+        </w:rPr>
+        <w:t>.</w:t>
+      </w:r>
+      <w:r>
+        <w:rPr>
+          <w:lang w:val="de-DE"/>
+        </w:rPr>
+        <w:t>w</w:t>
+      </w:r>
+      <w:r>
+        <w:rPr>
+          <w:lang w:val="el-GR"/>
+        </w:rPr>
+        <w:t>3.</w:t>
+      </w:r>
+      <w:r>
+        <w:rPr>
+          <w:lang w:val="de-DE"/>
+        </w:rPr>
+        <w:t>org</w:t>
+      </w:r>
+      <w:r>
+        <w:rPr>
+          <w:lang w:val="el-GR"/>
+        </w:rPr>
+        <w:t>/1999/</w:t>
+      </w:r>
+      <w:r>
+        <w:rPr>
+          <w:lang w:val="de-DE"/>
+        </w:rPr>
+        <w:t>xlink</w:t>
+      </w:r>
+      <w:r>
+        <w:rPr>
+          <w:lang w:val="el-GR"/>
+        </w:rPr>
+        <w:t>"&gt;&lt;</w:t>
+      </w:r>
+      <w:r>
+        <w:rPr>
+          <w:lang w:val="de-DE"/>
+        </w:rPr>
+        <w:t>g</w:t>
+      </w:r>
+      <w:r>
+        <w:rPr>
+          <w:lang w:val="el-GR"/>
+        </w:rPr>
+        <w:t xml:space="preserve"> </w:t>
+      </w:r>
+      <w:r>
+        <w:rPr>
+          <w:lang w:val="de-DE"/>
+        </w:rPr>
+        <w:t>stroke</w:t>
+      </w:r>
+      <w:r>
+        <w:rPr>
+          <w:lang w:val="de-DE"/>
+        </w:rPr>
+        <w:t>="</w:t>
+      </w:r>
+      <w:r>
+        <w:rPr>
+          <w:lang w:val="de-DE"/>
+        </w:rPr>
+        <w:t>none</w:t>
+      </w:r>
+      <w:r>
+        <w:rPr>
+          <w:lang w:val="de-DE"/>
+        </w:rPr>
+        <w:t xml:space="preserve">" </w:t>
+      </w:r>
+      <w:r>
+        <w:rPr>
+          <w:lang w:val="de-DE"/>
+        </w:rPr>
+        <w:t>stroke</w:t>
+      </w:r>
+      <w:r>
+        <w:rPr>
+          <w:lang w:val="de-DE"/>
+        </w:rPr>
+        <w:t>-</w:t>
+      </w:r>
+      <w:r>
+        <w:rPr>
+          <w:lang w:val="de-DE"/>
+        </w:rPr>
+        <w:t>width</w:t>
+      </w:r>
+      <w:r>
+        <w:rPr>
+          <w:lang w:val="de-DE"/>
+        </w:rPr>
+        <w:t xml:space="preserve">="1" </w:t>
+      </w:r>
+      <w:r>
+        <w:rPr>
+          <w:lang w:val="de-DE"/>
+        </w:rPr>
+        <w:t>fill</w:t>
+      </w:r>
+      <w:r>
+        <w:rPr>
+          <w:lang w:val="de-DE"/>
+        </w:rPr>
+        <w:t>="</w:t>
+      </w:r>
+      <w:r>
+        <w:rPr>
+          <w:lang w:val="de-DE"/>
+        </w:rPr>
+        <w:t>none</w:t>
+      </w:r>
+      <w:r>
+        <w:rPr>
+          <w:lang w:val="de-DE"/>
+        </w:rPr>
+        <w:t xml:space="preserve">" </w:t>
+      </w:r>
+      <w:r>
+        <w:rPr>
+          <w:lang w:val="de-DE"/>
+        </w:rPr>
+        <w:t>fill</w:t>
+      </w:r>
+      <w:r>
+        <w:rPr>
+          <w:lang w:val="de-DE"/>
+        </w:rPr>
+        <w:t>-</w:t>
+      </w:r>
+      <w:r>
+        <w:rPr>
+          <w:lang w:val="de-DE"/>
+        </w:rPr>
+        <w:t>rule</w:t>
+      </w:r>
+      <w:r>
+        <w:rPr>
+          <w:lang w:val="de-DE"/>
+        </w:rPr>
+        <w:t>="</w:t>
+      </w:r>
+      <w:r>
+        <w:rPr>
+          <w:lang w:val="de-DE"/>
+        </w:rPr>
+        <w:t>evenodd</w:t>
+      </w:r>
+      <w:r>
+        <w:rPr>
+          <w:lang w:val="de-DE"/>
+        </w:rPr>
+        <w:t>"&gt;&lt;</w:t>
+      </w:r>
+      <w:r>
+        <w:rPr>
+          <w:lang w:val="de-DE"/>
+        </w:rPr>
+        <w:t>g</w:t>
+      </w:r>
+      <w:r>
+        <w:rPr>
+          <w:lang w:val="de-DE"/>
+        </w:rPr>
+        <w:t xml:space="preserve"> </w:t>
+      </w:r>
+      <w:r>
+        <w:rPr>
+          <w:lang w:val="de-DE"/>
+        </w:rPr>
+        <w:t>transform</w:t>
+      </w:r>
+      <w:r>
+        <w:rPr>
+          <w:lang w:val="de-DE"/>
+        </w:rPr>
+        <w:t>="</w:t>
+      </w:r>
+      <w:r>
+        <w:rPr>
+          <w:lang w:val="de-DE"/>
+        </w:rPr>
+        <w:t>translate</w:t>
+      </w:r>
+      <w:r>
+        <w:rPr>
+          <w:lang w:val="de-DE"/>
+        </w:rPr>
+        <w:t xml:space="preserve">(-511.000000, -20.000000)" </w:t>
+      </w:r>
+      <w:r>
+        <w:rPr>
+          <w:lang w:val="de-DE"/>
+        </w:rPr>
+        <w:t>fill</w:t>
+      </w:r>
+      <w:r>
+        <w:rPr>
+          <w:lang w:val="de-DE"/>
+        </w:rPr>
+        <w:t>="#000000"&gt;&lt;</w:t>
+      </w:r>
+      <w:r>
+        <w:rPr>
+          <w:lang w:val="de-DE"/>
+        </w:rPr>
+        <w:t>g</w:t>
+      </w:r>
+      <w:r>
+        <w:rPr>
+          <w:lang w:val="de-DE"/>
+        </w:rPr>
+        <w:t>&gt;&lt;</w:t>
+      </w:r>
+      <w:r>
+        <w:rPr>
+          <w:lang w:val="de-DE"/>
+        </w:rPr>
+        <w:t>path</w:t>
+      </w:r>
+      <w:r>
+        <w:rPr>
+          <w:lang w:val="de-DE"/>
+        </w:rPr>
+        <w:t xml:space="preserve"> </w:t>
+      </w:r>
+      <w:r>
+        <w:rPr>
+          <w:lang w:val="de-DE"/>
+        </w:rPr>
+        <w:t>d</w:t>
+      </w:r>
+      <w:r>
+        <w:rPr>
+          <w:lang w:val="de-DE"/>
+        </w:rPr>
+        <w:t>="</w:t>
+      </w:r>
+      <w:r>
+        <w:rPr>
+          <w:lang w:val="de-DE"/>
+        </w:rPr>
+        <w:t>M</w:t>
+      </w:r>
+      <w:r>
+        <w:rPr>
+          <w:lang w:val="de-DE"/>
+        </w:rPr>
+        <w:t xml:space="preserve">556.869,30.41 </w:t>
+      </w:r>
+      <w:r>
+        <w:rPr>
+          <w:lang w:val="de-DE"/>
+        </w:rPr>
+        <w:t>C</w:t>
+      </w:r>
+      <w:r>
+        <w:rPr>
+          <w:lang w:val="de-DE"/>
+        </w:rPr>
+        <w:t xml:space="preserve">554.814,30.41 553.148,32.076 553.148,34.131 </w:t>
+      </w:r>
+      <w:r>
+        <w:rPr>
+          <w:lang w:val="de-DE"/>
+        </w:rPr>
+        <w:t>C</w:t>
+      </w:r>
+      <w:r>
+        <w:rPr>
+          <w:lang w:val="de-DE"/>
+        </w:rPr>
+        <w:t xml:space="preserve">553.148,36.186 554.814,37.852 556.869,37.852 </w:t>
+      </w:r>
+      <w:r>
+        <w:rPr>
+          <w:lang w:val="de-DE"/>
+        </w:rPr>
+        <w:t>C</w:t>
+      </w:r>
+      <w:r>
+        <w:rPr>
+          <w:lang w:val="de-DE"/>
+        </w:rPr>
+        <w:t xml:space="preserve">558.924,37.852 560.59,36.186 560.59,34.131 </w:t>
+      </w:r>
+      <w:r>
+        <w:rPr>
+          <w:lang w:val="de-DE"/>
+        </w:rPr>
+        <w:t>C</w:t>
+      </w:r>
+      <w:r>
+        <w:rPr>
+          <w:lang w:val="de-DE"/>
+        </w:rPr>
+        <w:t xml:space="preserve">560.59,32.076 558.924,30.41 556.869,30.41 </w:t>
+      </w:r>
+      <w:r>
+        <w:rPr>
+          <w:lang w:val="de-DE"/>
+        </w:rPr>
+        <w:t>M</w:t>
+      </w:r>
+      <w:r>
+        <w:rPr>
+          <w:lang w:val="de-DE"/>
+        </w:rPr>
+        <w:t xml:space="preserve">541,60.657 </w:t>
+      </w:r>
+      <w:r>
+        <w:rPr>
+          <w:lang w:val="de-DE"/>
+        </w:rPr>
+        <w:t>C</w:t>
+      </w:r>
+      <w:r>
+        <w:rPr>
+          <w:lang w:val="de-DE"/>
+        </w:rPr>
+        <w:t xml:space="preserve">535.114,60.657 530.342,55.887 530.342,50 </w:t>
+      </w:r>
+      <w:r>
+        <w:rPr>
+          <w:lang w:val="de-DE"/>
+        </w:rPr>
+        <w:t>C</w:t>
+      </w:r>
+      <w:r>
+        <w:rPr>
+          <w:lang w:val="de-DE"/>
+        </w:rPr>
+        <w:t xml:space="preserve">530.342,44.114 535.114,39.342 541,39.342 </w:t>
+      </w:r>
+      <w:r>
+        <w:rPr>
+          <w:lang w:val="de-DE"/>
+        </w:rPr>
+        <w:t>C</w:t>
+      </w:r>
+      <w:r>
+        <w:rPr>
+          <w:lang w:val="de-DE"/>
+        </w:rPr>
+        <w:t xml:space="preserve">546.887,39.342 551.658,44.114 551.658,50 </w:t>
+      </w:r>
+      <w:r>
+        <w:rPr>
+          <w:lang w:val="de-DE"/>
+        </w:rPr>
+        <w:t>C</w:t>
+      </w:r>
+      <w:r>
+        <w:rPr>
+          <w:lang w:val="de-DE"/>
+        </w:rPr>
+        <w:t xml:space="preserve">551.658,55.887 546.887,60.657 541,60.657 </w:t>
+      </w:r>
+      <w:r>
+        <w:rPr>
+          <w:lang w:val="de-DE"/>
+        </w:rPr>
+        <w:t>M</w:t>
+      </w:r>
+      <w:r>
+        <w:rPr>
+          <w:lang w:val="de-DE"/>
+        </w:rPr>
+        <w:t xml:space="preserve">541,33.886 </w:t>
+      </w:r>
+      <w:r>
+        <w:rPr>
+          <w:lang w:val="de-DE"/>
+        </w:rPr>
+        <w:t>C</w:t>
+      </w:r>
+      <w:r>
+        <w:rPr>
+          <w:lang w:val="de-DE"/>
+        </w:rPr>
+        <w:t xml:space="preserve">532.1,33.886 524.886,41.1 524.886,50 </w:t>
+      </w:r>
+      <w:r>
+        <w:rPr>
+          <w:lang w:val="de-DE"/>
+        </w:rPr>
+        <w:t>C</w:t>
+      </w:r>
+      <w:r>
+        <w:rPr>
+          <w:lang w:val="de-DE"/>
+        </w:rPr>
+        <w:t xml:space="preserve">524.886,58.899 532.1,66.113 541,66.113 </w:t>
+      </w:r>
+      <w:r>
+        <w:rPr>
+          <w:lang w:val="de-DE"/>
+        </w:rPr>
+        <w:t>C</w:t>
+      </w:r>
+      <w:r>
+        <w:rPr>
+          <w:lang w:val="de-DE"/>
+        </w:rPr>
+        <w:t xml:space="preserve">549.9,66.113 557.115,58.899 557.115,50 </w:t>
+      </w:r>
+      <w:r>
+        <w:rPr>
+          <w:lang w:val="de-DE"/>
+        </w:rPr>
+        <w:t>C</w:t>
+      </w:r>
+      <w:r>
+        <w:rPr>
+          <w:lang w:val="de-DE"/>
+        </w:rPr>
+        <w:t xml:space="preserve">557.115,41.1 549.9,33.886 541,33.886 </w:t>
+      </w:r>
+      <w:r>
+        <w:rPr>
+          <w:lang w:val="de-DE"/>
+        </w:rPr>
+        <w:t>M</w:t>
+      </w:r>
+      <w:r>
+        <w:rPr>
+          <w:lang w:val="de-DE"/>
+        </w:rPr>
+        <w:t xml:space="preserve">565.378,62.101 </w:t>
+      </w:r>
+      <w:r>
+        <w:rPr>
+          <w:lang w:val="de-DE"/>
+        </w:rPr>
+        <w:t>C</w:t>
+      </w:r>
+      <w:r>
+        <w:rPr>
+          <w:lang w:val="de-DE"/>
+        </w:rPr>
+        <w:t xml:space="preserve">565.244,65.022 564.756,66.606 564.346,67.663 </w:t>
+      </w:r>
+      <w:r>
+        <w:rPr>
+          <w:lang w:val="de-DE"/>
+        </w:rPr>
+        <w:t>C</w:t>
+      </w:r>
+      <w:r>
+        <w:rPr>
+          <w:lang w:val="de-DE"/>
+        </w:rPr>
+        <w:t xml:space="preserve">563.803,69.06 563.154,70.057 562.106,71.106 </w:t>
+      </w:r>
+      <w:r>
+        <w:rPr>
+          <w:lang w:val="de-DE"/>
+        </w:rPr>
+        <w:t>C</w:t>
+      </w:r>
+      <w:r>
+        <w:rPr>
+          <w:lang w:val="de-DE"/>
+        </w:rPr>
+        <w:t xml:space="preserve">561.058,72.155 560.06,72.803 558.662,73.347 </w:t>
+      </w:r>
+      <w:r>
+        <w:rPr>
+          <w:lang w:val="de-DE"/>
+        </w:rPr>
+        <w:t>C</w:t>
+      </w:r>
+      <w:r>
+        <w:rPr>
+          <w:lang w:val="de-DE"/>
+        </w:rPr>
+        <w:t xml:space="preserve">557.607,73.757 556.021,74.244 553.102,74.378 </w:t>
+      </w:r>
+      <w:r>
+        <w:rPr>
+          <w:lang w:val="de-DE"/>
+        </w:rPr>
+        <w:t>C</w:t>
+      </w:r>
+      <w:r>
+        <w:rPr>
+          <w:lang w:val="de-DE"/>
+        </w:rPr>
+        <w:t xml:space="preserve">549.944,74.521 548.997,74.552 541,74.552 </w:t>
+      </w:r>
+      <w:r>
+        <w:rPr>
+          <w:lang w:val="de-DE"/>
+        </w:rPr>
+        <w:t>C</w:t>
+      </w:r>
+      <w:r>
+        <w:rPr>
+          <w:lang w:val="de-DE"/>
+        </w:rPr>
+        <w:t xml:space="preserve">533.003,74.552 532.056,74.521 528.898,74.378 </w:t>
+      </w:r>
+      <w:r>
+        <w:rPr>
+          <w:lang w:val="de-DE"/>
+        </w:rPr>
+        <w:t>C</w:t>
+      </w:r>
+      <w:r>
+        <w:rPr>
+          <w:lang w:val="de-DE"/>
+        </w:rPr>
+        <w:t xml:space="preserve">525.979,74.244 524.393,73.757 523.338,73.347 </w:t>
+      </w:r>
+      <w:r>
+        <w:rPr>
+          <w:lang w:val="de-DE"/>
+        </w:rPr>
+        <w:t>C</w:t>
+      </w:r>
+      <w:r>
+        <w:rPr>
+          <w:lang w:val="de-DE"/>
+        </w:rPr>
+        <w:t xml:space="preserve">521.94,72.803 520.942,72.155 519.894,71.106 </w:t>
+      </w:r>
+      <w:r>
+        <w:rPr>
+          <w:lang w:val="de-DE"/>
+        </w:rPr>
+        <w:t>C</w:t>
+      </w:r>
+      <w:r>
+        <w:rPr>
+          <w:lang w:val="de-DE"/>
+        </w:rPr>
+        <w:t xml:space="preserve">518.846,70.057 518.197,69.06 517.654,67.663 </w:t>
+      </w:r>
+      <w:r>
+        <w:rPr>
+          <w:lang w:val="de-DE"/>
+        </w:rPr>
+        <w:t>C</w:t>
+      </w:r>
+      <w:r>
+        <w:rPr>
+          <w:lang w:val="de-DE"/>
+        </w:rPr>
+        <w:t xml:space="preserve">517.244,66.606 516.755,65.022 516.623,62.101 </w:t>
+      </w:r>
+      <w:r>
+        <w:rPr>
+          <w:lang w:val="de-DE"/>
+        </w:rPr>
+        <w:t>C</w:t>
+      </w:r>
+      <w:r>
+        <w:rPr>
+          <w:lang w:val="de-DE"/>
+        </w:rPr>
+        <w:t xml:space="preserve">516.479,58.943 516.448,57.996 516.448,50 </w:t>
+      </w:r>
+      <w:r>
+        <w:rPr>
+          <w:lang w:val="de-DE"/>
+        </w:rPr>
+        <w:t>C</w:t>
+      </w:r>
+      <w:r>
+        <w:rPr>
+          <w:lang w:val="de-DE"/>
+        </w:rPr>
+        <w:t xml:space="preserve">516.448,42.003 516.479,41.056 516.623,37.899 </w:t>
+      </w:r>
+      <w:r>
+        <w:rPr>
+          <w:lang w:val="de-DE"/>
+        </w:rPr>
+        <w:t>C</w:t>
+      </w:r>
+      <w:r>
+        <w:rPr>
+          <w:lang w:val="de-DE"/>
+        </w:rPr>
+        <w:t xml:space="preserve">516.755,34.978 517.244,33.391 517.654,32.338 </w:t>
+      </w:r>
+      <w:r>
+        <w:rPr>
+          <w:lang w:val="de-DE"/>
+        </w:rPr>
+        <w:t>C</w:t>
+      </w:r>
+      <w:r>
+        <w:rPr>
+          <w:lang w:val="de-DE"/>
+        </w:rPr>
+        <w:t xml:space="preserve">518.197,30.938 518.846,29.942 519.894,28.894 </w:t>
+      </w:r>
+      <w:r>
+        <w:rPr>
+          <w:lang w:val="de-DE"/>
+        </w:rPr>
+        <w:t>C</w:t>
+      </w:r>
+      <w:r>
+        <w:rPr>
+          <w:lang w:val="de-DE"/>
+        </w:rPr>
+        <w:t xml:space="preserve">520.942,27.846 521.94,27.196 523.338,26.654 </w:t>
+      </w:r>
+      <w:r>
+        <w:rPr>
+          <w:lang w:val="de-DE"/>
+        </w:rPr>
+        <w:t>C</w:t>
+      </w:r>
+      <w:r>
+        <w:rPr>
+          <w:lang w:val="de-DE"/>
+        </w:rPr>
+        <w:t xml:space="preserve">524.393,26.244 525.979,25.756 528.898,25.623 </w:t>
+      </w:r>
+      <w:r>
+        <w:rPr>
+          <w:lang w:val="de-DE"/>
+        </w:rPr>
+        <w:t>C</w:t>
+      </w:r>
+      <w:r>
+        <w:rPr>
+          <w:lang w:val="de-DE"/>
+        </w:rPr>
+        <w:t xml:space="preserve">532.057,25.479 533.004,25.448 541,25.448 </w:t>
+      </w:r>
+      <w:r>
+        <w:rPr>
+          <w:lang w:val="de-DE"/>
+        </w:rPr>
+        <w:t>C</w:t>
+      </w:r>
+      <w:r>
+        <w:rPr>
+          <w:lang w:val="de-DE"/>
+        </w:rPr>
+        <w:t>548.997,25.448 549.943,25.479 553.102,</w:t>
+      </w:r>
+      <w:r>
+        <w:rPr>
+          <w:lang w:val="de-DE"/>
+        </w:rPr>
+        <w:t xml:space="preserve">25.623 C556.021,25.756 557.607,26.244 558.662,26.654 C560.06,27.196 561.058,27.846 562.106,28.894 C563.154,29.942 563.803,30.938 564.346,32.338 C564.756,33.391 565.244,34.978 565.378,37.899 C565.522,41.056 565.552,42.003 565.552,50 C565.552,57.996 565.522,58.943 565.378,62.101 M570.82,37.631 C570.674,34.438 570.167,32.258 569.425,30.349 C568.659,28.377 567.633,26.702 </w:t>
       </w:r>
       <w:r>
         <w:rPr>

</xml_diff>